<commit_message>
beetwen first and second week
</commit_message>
<xml_diff>
--- a/Recherchephase.docx
+++ b/Recherchephase.docx
@@ -110,9 +110,15 @@
     <w:sdt>
       <w:sdtPr>
         <w:rPr>
-          <w:rFonts w:ascii="Arial" w:hAnsi="Arial" w:cs="Arial"/>
-        </w:rPr>
-        <w:id w:val="-486872463"/>
+          <w:rFonts w:ascii="Arial" w:eastAsiaTheme="minorHAnsi" w:hAnsi="Arial" w:cs="Arial"/>
+          <w:color w:val="auto"/>
+          <w:kern w:val="2"/>
+          <w:sz w:val="24"/>
+          <w:szCs w:val="24"/>
+          <w:lang w:eastAsia="en-US"/>
+          <w14:ligatures w14:val="standardContextual"/>
+        </w:rPr>
+        <w:id w:val="-1704243500"/>
         <w:docPartObj>
           <w:docPartGallery w:val="Table of Contents"/>
           <w:docPartUnique/>
@@ -120,15 +126,8 @@
       </w:sdtPr>
       <w:sdtEndPr>
         <w:rPr>
-          <w:rFonts w:eastAsiaTheme="minorHAnsi"/>
           <w:b/>
           <w:bCs/>
-          <w:color w:val="auto"/>
-          <w:kern w:val="2"/>
-          <w:sz w:val="24"/>
-          <w:szCs w:val="24"/>
-          <w:lang w:eastAsia="en-US"/>
-          <w14:ligatures w14:val="standardContextual"/>
         </w:rPr>
       </w:sdtEndPr>
       <w:sdtContent>
@@ -153,7 +152,7 @@
               <w:tab w:val="right" w:leader="dot" w:pos="9062"/>
             </w:tabs>
             <w:rPr>
-              <w:rFonts w:eastAsiaTheme="minorEastAsia"/>
+              <w:rFonts w:ascii="Arial" w:eastAsiaTheme="minorEastAsia" w:hAnsi="Arial" w:cs="Arial"/>
               <w:noProof/>
               <w:lang w:eastAsia="de-DE"/>
             </w:rPr>
@@ -176,17 +175,96 @@
             </w:rPr>
             <w:fldChar w:fldCharType="separate"/>
           </w:r>
-          <w:hyperlink w:anchor="_Toc240022157" w:history="1">
+          <w:hyperlink w:anchor="_Toc240287879" w:history="1">
             <w:r>
               <w:rPr>
                 <w:rStyle w:val="Hyperlink"/>
-                <w:rFonts w:cs="Arial"/>
+                <w:rFonts w:ascii="Arial" w:hAnsi="Arial" w:cs="Arial"/>
+                <w:noProof/>
+              </w:rPr>
+              <w:t>1) Fragen in der Angabe</w:t>
+            </w:r>
+            <w:r>
+              <w:rPr>
+                <w:rFonts w:ascii="Arial" w:hAnsi="Arial" w:cs="Arial"/>
+                <w:noProof/>
+                <w:webHidden/>
+              </w:rPr>
+              <w:tab/>
+            </w:r>
+            <w:r>
+              <w:rPr>
+                <w:rFonts w:ascii="Arial" w:hAnsi="Arial" w:cs="Arial"/>
+                <w:noProof/>
+                <w:webHidden/>
+              </w:rPr>
+              <w:fldChar w:fldCharType="begin"/>
+            </w:r>
+            <w:r>
+              <w:rPr>
+                <w:rFonts w:ascii="Arial" w:hAnsi="Arial" w:cs="Arial"/>
+                <w:noProof/>
+                <w:webHidden/>
+              </w:rPr>
+              <w:instrText xml:space="preserve"> PAGEREF _Toc240287879 \h </w:instrText>
+            </w:r>
+            <w:r>
+              <w:rPr>
+                <w:rFonts w:ascii="Arial" w:hAnsi="Arial" w:cs="Arial"/>
+                <w:noProof/>
+                <w:webHidden/>
+              </w:rPr>
+            </w:r>
+            <w:r>
+              <w:rPr>
+                <w:rFonts w:ascii="Arial" w:hAnsi="Arial" w:cs="Arial"/>
+                <w:noProof/>
+                <w:webHidden/>
+              </w:rPr>
+              <w:fldChar w:fldCharType="separate"/>
+            </w:r>
+            <w:r>
+              <w:rPr>
+                <w:rFonts w:ascii="Arial" w:hAnsi="Arial" w:cs="Arial"/>
+                <w:noProof/>
+                <w:webHidden/>
+              </w:rPr>
+              <w:t>3</w:t>
+            </w:r>
+            <w:r>
+              <w:rPr>
+                <w:rFonts w:ascii="Arial" w:hAnsi="Arial" w:cs="Arial"/>
+                <w:noProof/>
+                <w:webHidden/>
+              </w:rPr>
+              <w:fldChar w:fldCharType="end"/>
+            </w:r>
+          </w:hyperlink>
+        </w:p>
+        <w:p>
+          <w:pPr>
+            <w:pStyle w:val="Verzeichnis2"/>
+            <w:tabs>
+              <w:tab w:val="right" w:leader="dot" w:pos="9062"/>
+            </w:tabs>
+            <w:rPr>
+              <w:rFonts w:ascii="Arial" w:eastAsiaTheme="minorEastAsia" w:hAnsi="Arial" w:cs="Arial"/>
+              <w:noProof/>
+              <w:lang w:eastAsia="de-DE"/>
+            </w:rPr>
+          </w:pPr>
+          <w:hyperlink w:anchor="_Toc240287880" w:history="1">
+            <w:r>
+              <w:rPr>
+                <w:rStyle w:val="Hyperlink"/>
+                <w:rFonts w:ascii="Arial" w:hAnsi="Arial" w:cs="Arial"/>
                 <w:noProof/>
               </w:rPr>
               <w:t>Welche Vorteile kann eine Handygarage im familiären Umfeld haben?</w:t>
             </w:r>
             <w:r>
               <w:rPr>
+                <w:rFonts w:ascii="Arial" w:hAnsi="Arial" w:cs="Arial"/>
                 <w:noProof/>
                 <w:webHidden/>
               </w:rPr>
@@ -194,6 +272,7 @@
             </w:r>
             <w:r>
               <w:rPr>
+                <w:rFonts w:ascii="Arial" w:hAnsi="Arial" w:cs="Arial"/>
                 <w:noProof/>
                 <w:webHidden/>
               </w:rPr>
@@ -201,19 +280,22 @@
             </w:r>
             <w:r>
               <w:rPr>
-                <w:noProof/>
-                <w:webHidden/>
-              </w:rPr>
-              <w:instrText xml:space="preserve"> PAGEREF _Toc240022157 \h </w:instrText>
-            </w:r>
-            <w:r>
-              <w:rPr>
-                <w:noProof/>
-                <w:webHidden/>
-              </w:rPr>
-            </w:r>
-            <w:r>
-              <w:rPr>
+                <w:rFonts w:ascii="Arial" w:hAnsi="Arial" w:cs="Arial"/>
+                <w:noProof/>
+                <w:webHidden/>
+              </w:rPr>
+              <w:instrText xml:space="preserve"> PAGEREF _Toc240287880 \h </w:instrText>
+            </w:r>
+            <w:r>
+              <w:rPr>
+                <w:rFonts w:ascii="Arial" w:hAnsi="Arial" w:cs="Arial"/>
+                <w:noProof/>
+                <w:webHidden/>
+              </w:rPr>
+            </w:r>
+            <w:r>
+              <w:rPr>
+                <w:rFonts w:ascii="Arial" w:hAnsi="Arial" w:cs="Arial"/>
                 <w:noProof/>
                 <w:webHidden/>
               </w:rPr>
@@ -221,6 +303,7 @@
             </w:r>
             <w:r>
               <w:rPr>
+                <w:rFonts w:ascii="Arial" w:hAnsi="Arial" w:cs="Arial"/>
                 <w:noProof/>
                 <w:webHidden/>
               </w:rPr>
@@ -228,6 +311,319 @@
             </w:r>
             <w:r>
               <w:rPr>
+                <w:rFonts w:ascii="Arial" w:hAnsi="Arial" w:cs="Arial"/>
+                <w:noProof/>
+                <w:webHidden/>
+              </w:rPr>
+              <w:fldChar w:fldCharType="end"/>
+            </w:r>
+          </w:hyperlink>
+        </w:p>
+        <w:p>
+          <w:pPr>
+            <w:pStyle w:val="Verzeichnis2"/>
+            <w:tabs>
+              <w:tab w:val="right" w:leader="dot" w:pos="9062"/>
+            </w:tabs>
+            <w:rPr>
+              <w:rFonts w:ascii="Arial" w:eastAsiaTheme="minorEastAsia" w:hAnsi="Arial" w:cs="Arial"/>
+              <w:noProof/>
+              <w:lang w:eastAsia="de-DE"/>
+            </w:rPr>
+          </w:pPr>
+          <w:hyperlink w:anchor="_Toc240287881" w:history="1">
+            <w:r>
+              <w:rPr>
+                <w:rStyle w:val="Hyperlink"/>
+                <w:rFonts w:ascii="Arial" w:hAnsi="Arial" w:cs="Arial"/>
+                <w:noProof/>
+              </w:rPr>
+              <w:t>Welche Situationen eignen sich besonders für eine Smartphone-Ablage?</w:t>
+            </w:r>
+            <w:r>
+              <w:rPr>
+                <w:rFonts w:ascii="Arial" w:hAnsi="Arial" w:cs="Arial"/>
+                <w:noProof/>
+                <w:webHidden/>
+              </w:rPr>
+              <w:tab/>
+            </w:r>
+            <w:r>
+              <w:rPr>
+                <w:rFonts w:ascii="Arial" w:hAnsi="Arial" w:cs="Arial"/>
+                <w:noProof/>
+                <w:webHidden/>
+              </w:rPr>
+              <w:fldChar w:fldCharType="begin"/>
+            </w:r>
+            <w:r>
+              <w:rPr>
+                <w:rFonts w:ascii="Arial" w:hAnsi="Arial" w:cs="Arial"/>
+                <w:noProof/>
+                <w:webHidden/>
+              </w:rPr>
+              <w:instrText xml:space="preserve"> PAGEREF _Toc240287881 \h </w:instrText>
+            </w:r>
+            <w:r>
+              <w:rPr>
+                <w:rFonts w:ascii="Arial" w:hAnsi="Arial" w:cs="Arial"/>
+                <w:noProof/>
+                <w:webHidden/>
+              </w:rPr>
+            </w:r>
+            <w:r>
+              <w:rPr>
+                <w:rFonts w:ascii="Arial" w:hAnsi="Arial" w:cs="Arial"/>
+                <w:noProof/>
+                <w:webHidden/>
+              </w:rPr>
+              <w:fldChar w:fldCharType="separate"/>
+            </w:r>
+            <w:r>
+              <w:rPr>
+                <w:rFonts w:ascii="Arial" w:hAnsi="Arial" w:cs="Arial"/>
+                <w:noProof/>
+                <w:webHidden/>
+              </w:rPr>
+              <w:t>3</w:t>
+            </w:r>
+            <w:r>
+              <w:rPr>
+                <w:rFonts w:ascii="Arial" w:hAnsi="Arial" w:cs="Arial"/>
+                <w:noProof/>
+                <w:webHidden/>
+              </w:rPr>
+              <w:fldChar w:fldCharType="end"/>
+            </w:r>
+          </w:hyperlink>
+        </w:p>
+        <w:p>
+          <w:pPr>
+            <w:pStyle w:val="Verzeichnis2"/>
+            <w:tabs>
+              <w:tab w:val="right" w:leader="dot" w:pos="9062"/>
+            </w:tabs>
+            <w:rPr>
+              <w:rFonts w:ascii="Arial" w:eastAsiaTheme="minorEastAsia" w:hAnsi="Arial" w:cs="Arial"/>
+              <w:noProof/>
+              <w:lang w:eastAsia="de-DE"/>
+            </w:rPr>
+          </w:pPr>
+          <w:hyperlink w:anchor="_Toc240287882" w:history="1">
+            <w:r>
+              <w:rPr>
+                <w:rStyle w:val="Hyperlink"/>
+                <w:rFonts w:ascii="Arial" w:hAnsi="Arial" w:cs="Arial"/>
+                <w:noProof/>
+              </w:rPr>
+              <w:t>Welche möglichen Probleme oder Nachteile könnten entstehen?</w:t>
+            </w:r>
+            <w:r>
+              <w:rPr>
+                <w:rFonts w:ascii="Arial" w:hAnsi="Arial" w:cs="Arial"/>
+                <w:noProof/>
+                <w:webHidden/>
+              </w:rPr>
+              <w:tab/>
+            </w:r>
+            <w:r>
+              <w:rPr>
+                <w:rFonts w:ascii="Arial" w:hAnsi="Arial" w:cs="Arial"/>
+                <w:noProof/>
+                <w:webHidden/>
+              </w:rPr>
+              <w:fldChar w:fldCharType="begin"/>
+            </w:r>
+            <w:r>
+              <w:rPr>
+                <w:rFonts w:ascii="Arial" w:hAnsi="Arial" w:cs="Arial"/>
+                <w:noProof/>
+                <w:webHidden/>
+              </w:rPr>
+              <w:instrText xml:space="preserve"> PAGEREF _Toc240287882 \h </w:instrText>
+            </w:r>
+            <w:r>
+              <w:rPr>
+                <w:rFonts w:ascii="Arial" w:hAnsi="Arial" w:cs="Arial"/>
+                <w:noProof/>
+                <w:webHidden/>
+              </w:rPr>
+            </w:r>
+            <w:r>
+              <w:rPr>
+                <w:rFonts w:ascii="Arial" w:hAnsi="Arial" w:cs="Arial"/>
+                <w:noProof/>
+                <w:webHidden/>
+              </w:rPr>
+              <w:fldChar w:fldCharType="separate"/>
+            </w:r>
+            <w:r>
+              <w:rPr>
+                <w:rFonts w:ascii="Arial" w:hAnsi="Arial" w:cs="Arial"/>
+                <w:noProof/>
+                <w:webHidden/>
+              </w:rPr>
+              <w:t>3</w:t>
+            </w:r>
+            <w:r>
+              <w:rPr>
+                <w:rFonts w:ascii="Arial" w:hAnsi="Arial" w:cs="Arial"/>
+                <w:noProof/>
+                <w:webHidden/>
+              </w:rPr>
+              <w:fldChar w:fldCharType="end"/>
+            </w:r>
+          </w:hyperlink>
+        </w:p>
+        <w:p>
+          <w:pPr>
+            <w:pStyle w:val="Verzeichnis2"/>
+            <w:tabs>
+              <w:tab w:val="right" w:leader="dot" w:pos="9062"/>
+            </w:tabs>
+            <w:rPr>
+              <w:rFonts w:ascii="Arial" w:eastAsiaTheme="minorEastAsia" w:hAnsi="Arial" w:cs="Arial"/>
+              <w:noProof/>
+              <w:lang w:eastAsia="de-DE"/>
+            </w:rPr>
+          </w:pPr>
+          <w:hyperlink w:anchor="_Toc240287883" w:history="1">
+            <w:r>
+              <w:rPr>
+                <w:rStyle w:val="Hyperlink"/>
+                <w:rFonts w:ascii="Arial" w:hAnsi="Arial" w:cs="Arial"/>
+                <w:noProof/>
+              </w:rPr>
+              <w:t>Welche Geräte/ Ablagesysteme gibt es bereits?</w:t>
+            </w:r>
+            <w:r>
+              <w:rPr>
+                <w:rFonts w:ascii="Arial" w:hAnsi="Arial" w:cs="Arial"/>
+                <w:noProof/>
+                <w:webHidden/>
+              </w:rPr>
+              <w:tab/>
+            </w:r>
+            <w:r>
+              <w:rPr>
+                <w:rFonts w:ascii="Arial" w:hAnsi="Arial" w:cs="Arial"/>
+                <w:noProof/>
+                <w:webHidden/>
+              </w:rPr>
+              <w:fldChar w:fldCharType="begin"/>
+            </w:r>
+            <w:r>
+              <w:rPr>
+                <w:rFonts w:ascii="Arial" w:hAnsi="Arial" w:cs="Arial"/>
+                <w:noProof/>
+                <w:webHidden/>
+              </w:rPr>
+              <w:instrText xml:space="preserve"> PAGEREF _Toc240287883 \h </w:instrText>
+            </w:r>
+            <w:r>
+              <w:rPr>
+                <w:rFonts w:ascii="Arial" w:hAnsi="Arial" w:cs="Arial"/>
+                <w:noProof/>
+                <w:webHidden/>
+              </w:rPr>
+            </w:r>
+            <w:r>
+              <w:rPr>
+                <w:rFonts w:ascii="Arial" w:hAnsi="Arial" w:cs="Arial"/>
+                <w:noProof/>
+                <w:webHidden/>
+              </w:rPr>
+              <w:fldChar w:fldCharType="separate"/>
+            </w:r>
+            <w:r>
+              <w:rPr>
+                <w:rFonts w:ascii="Arial" w:hAnsi="Arial" w:cs="Arial"/>
+                <w:noProof/>
+                <w:webHidden/>
+              </w:rPr>
+              <w:t>3</w:t>
+            </w:r>
+            <w:r>
+              <w:rPr>
+                <w:rFonts w:ascii="Arial" w:hAnsi="Arial" w:cs="Arial"/>
+                <w:noProof/>
+                <w:webHidden/>
+              </w:rPr>
+              <w:fldChar w:fldCharType="end"/>
+            </w:r>
+          </w:hyperlink>
+        </w:p>
+        <w:p>
+          <w:pPr>
+            <w:pStyle w:val="Verzeichnis2"/>
+            <w:tabs>
+              <w:tab w:val="right" w:leader="dot" w:pos="9062"/>
+            </w:tabs>
+            <w:rPr>
+              <w:rFonts w:ascii="Arial" w:eastAsiaTheme="minorEastAsia" w:hAnsi="Arial" w:cs="Arial"/>
+              <w:noProof/>
+              <w:lang w:eastAsia="de-DE"/>
+            </w:rPr>
+          </w:pPr>
+          <w:hyperlink w:anchor="_Toc240287884" w:history="1">
+            <w:r>
+              <w:rPr>
+                <w:rStyle w:val="Hyperlink"/>
+                <w:rFonts w:ascii="Arial" w:hAnsi="Arial" w:cs="Arial"/>
+                <w:noProof/>
+              </w:rPr>
+              <w:t>Welche technischen Möglichkeiten (Werkzeuge, Material, etc.) können für das Konzept herangezogen werden?</w:t>
+            </w:r>
+            <w:r>
+              <w:rPr>
+                <w:rFonts w:ascii="Arial" w:hAnsi="Arial" w:cs="Arial"/>
+                <w:noProof/>
+                <w:webHidden/>
+              </w:rPr>
+              <w:tab/>
+            </w:r>
+            <w:r>
+              <w:rPr>
+                <w:rFonts w:ascii="Arial" w:hAnsi="Arial" w:cs="Arial"/>
+                <w:noProof/>
+                <w:webHidden/>
+              </w:rPr>
+              <w:fldChar w:fldCharType="begin"/>
+            </w:r>
+            <w:r>
+              <w:rPr>
+                <w:rFonts w:ascii="Arial" w:hAnsi="Arial" w:cs="Arial"/>
+                <w:noProof/>
+                <w:webHidden/>
+              </w:rPr>
+              <w:instrText xml:space="preserve"> PAGEREF _Toc240287884 \h </w:instrText>
+            </w:r>
+            <w:r>
+              <w:rPr>
+                <w:rFonts w:ascii="Arial" w:hAnsi="Arial" w:cs="Arial"/>
+                <w:noProof/>
+                <w:webHidden/>
+              </w:rPr>
+            </w:r>
+            <w:r>
+              <w:rPr>
+                <w:rFonts w:ascii="Arial" w:hAnsi="Arial" w:cs="Arial"/>
+                <w:noProof/>
+                <w:webHidden/>
+              </w:rPr>
+              <w:fldChar w:fldCharType="separate"/>
+            </w:r>
+            <w:r>
+              <w:rPr>
+                <w:rFonts w:ascii="Arial" w:hAnsi="Arial" w:cs="Arial"/>
+                <w:noProof/>
+                <w:webHidden/>
+              </w:rPr>
+              <w:t>4</w:t>
+            </w:r>
+            <w:r>
+              <w:rPr>
+                <w:rFonts w:ascii="Arial" w:hAnsi="Arial" w:cs="Arial"/>
                 <w:noProof/>
                 <w:webHidden/>
               </w:rPr>
@@ -242,22 +638,23 @@
               <w:tab w:val="right" w:leader="dot" w:pos="9062"/>
             </w:tabs>
             <w:rPr>
-              <w:rFonts w:eastAsiaTheme="minorEastAsia"/>
+              <w:rFonts w:ascii="Arial" w:eastAsiaTheme="minorEastAsia" w:hAnsi="Arial" w:cs="Arial"/>
               <w:noProof/>
               <w:lang w:eastAsia="de-DE"/>
             </w:rPr>
           </w:pPr>
-          <w:hyperlink w:anchor="_Toc240022158" w:history="1">
+          <w:hyperlink w:anchor="_Toc240287885" w:history="1">
             <w:r>
               <w:rPr>
                 <w:rStyle w:val="Hyperlink"/>
-                <w:rFonts w:cs="Arial"/>
-                <w:noProof/>
-              </w:rPr>
-              <w:t>Welche Situationen eignen sich besonders für eine Smartphone-Ablage?</w:t>
-            </w:r>
-            <w:r>
-              <w:rPr>
+                <w:rFonts w:ascii="Arial" w:hAnsi="Arial" w:cs="Arial"/>
+                <w:noProof/>
+              </w:rPr>
+              <w:t>2)Rahmenbedingungen</w:t>
+            </w:r>
+            <w:r>
+              <w:rPr>
+                <w:rFonts w:ascii="Arial" w:hAnsi="Arial" w:cs="Arial"/>
                 <w:noProof/>
                 <w:webHidden/>
               </w:rPr>
@@ -265,6 +662,7 @@
             </w:r>
             <w:r>
               <w:rPr>
+                <w:rFonts w:ascii="Arial" w:hAnsi="Arial" w:cs="Arial"/>
                 <w:noProof/>
                 <w:webHidden/>
               </w:rPr>
@@ -272,19 +670,22 @@
             </w:r>
             <w:r>
               <w:rPr>
-                <w:noProof/>
-                <w:webHidden/>
-              </w:rPr>
-              <w:instrText xml:space="preserve"> PAGEREF _Toc240022158 \h </w:instrText>
-            </w:r>
-            <w:r>
-              <w:rPr>
-                <w:noProof/>
-                <w:webHidden/>
-              </w:rPr>
-            </w:r>
-            <w:r>
-              <w:rPr>
+                <w:rFonts w:ascii="Arial" w:hAnsi="Arial" w:cs="Arial"/>
+                <w:noProof/>
+                <w:webHidden/>
+              </w:rPr>
+              <w:instrText xml:space="preserve"> PAGEREF _Toc240287885 \h </w:instrText>
+            </w:r>
+            <w:r>
+              <w:rPr>
+                <w:rFonts w:ascii="Arial" w:hAnsi="Arial" w:cs="Arial"/>
+                <w:noProof/>
+                <w:webHidden/>
+              </w:rPr>
+            </w:r>
+            <w:r>
+              <w:rPr>
+                <w:rFonts w:ascii="Arial" w:hAnsi="Arial" w:cs="Arial"/>
                 <w:noProof/>
                 <w:webHidden/>
               </w:rPr>
@@ -292,13 +693,490 @@
             </w:r>
             <w:r>
               <w:rPr>
-                <w:noProof/>
-                <w:webHidden/>
-              </w:rPr>
-              <w:t>3</w:t>
-            </w:r>
-            <w:r>
-              <w:rPr>
+                <w:rFonts w:ascii="Arial" w:hAnsi="Arial" w:cs="Arial"/>
+                <w:noProof/>
+                <w:webHidden/>
+              </w:rPr>
+              <w:t>5</w:t>
+            </w:r>
+            <w:r>
+              <w:rPr>
+                <w:rFonts w:ascii="Arial" w:hAnsi="Arial" w:cs="Arial"/>
+                <w:noProof/>
+                <w:webHidden/>
+              </w:rPr>
+              <w:fldChar w:fldCharType="end"/>
+            </w:r>
+          </w:hyperlink>
+        </w:p>
+        <w:p>
+          <w:pPr>
+            <w:pStyle w:val="Verzeichnis2"/>
+            <w:tabs>
+              <w:tab w:val="left" w:pos="720"/>
+              <w:tab w:val="right" w:leader="dot" w:pos="9062"/>
+            </w:tabs>
+            <w:rPr>
+              <w:rFonts w:ascii="Arial" w:eastAsiaTheme="minorEastAsia" w:hAnsi="Arial" w:cs="Arial"/>
+              <w:noProof/>
+              <w:lang w:eastAsia="de-DE"/>
+            </w:rPr>
+          </w:pPr>
+          <w:hyperlink w:anchor="_Toc240287886" w:history="1">
+            <w:r>
+              <w:rPr>
+                <w:rStyle w:val="Hyperlink"/>
+                <w:rFonts w:ascii="Arial" w:hAnsi="Arial" w:cs="Arial"/>
+                <w:noProof/>
+              </w:rPr>
+              <w:t></w:t>
+            </w:r>
+            <w:r>
+              <w:rPr>
+                <w:rFonts w:ascii="Arial" w:eastAsiaTheme="minorEastAsia" w:hAnsi="Arial" w:cs="Arial"/>
+                <w:noProof/>
+                <w:lang w:eastAsia="de-DE"/>
+              </w:rPr>
+              <w:tab/>
+            </w:r>
+            <w:r>
+              <w:rPr>
+                <w:rStyle w:val="Hyperlink"/>
+                <w:rFonts w:ascii="Arial" w:hAnsi="Arial" w:cs="Arial"/>
+                <w:noProof/>
+              </w:rPr>
+              <w:t>Technische Anforderungen</w:t>
+            </w:r>
+            <w:r>
+              <w:rPr>
+                <w:rFonts w:ascii="Arial" w:hAnsi="Arial" w:cs="Arial"/>
+                <w:noProof/>
+                <w:webHidden/>
+              </w:rPr>
+              <w:tab/>
+            </w:r>
+            <w:r>
+              <w:rPr>
+                <w:rFonts w:ascii="Arial" w:hAnsi="Arial" w:cs="Arial"/>
+                <w:noProof/>
+                <w:webHidden/>
+              </w:rPr>
+              <w:fldChar w:fldCharType="begin"/>
+            </w:r>
+            <w:r>
+              <w:rPr>
+                <w:rFonts w:ascii="Arial" w:hAnsi="Arial" w:cs="Arial"/>
+                <w:noProof/>
+                <w:webHidden/>
+              </w:rPr>
+              <w:instrText xml:space="preserve"> PAGEREF _Toc240287886 \h </w:instrText>
+            </w:r>
+            <w:r>
+              <w:rPr>
+                <w:rFonts w:ascii="Arial" w:hAnsi="Arial" w:cs="Arial"/>
+                <w:noProof/>
+                <w:webHidden/>
+              </w:rPr>
+            </w:r>
+            <w:r>
+              <w:rPr>
+                <w:rFonts w:ascii="Arial" w:hAnsi="Arial" w:cs="Arial"/>
+                <w:noProof/>
+                <w:webHidden/>
+              </w:rPr>
+              <w:fldChar w:fldCharType="separate"/>
+            </w:r>
+            <w:r>
+              <w:rPr>
+                <w:rFonts w:ascii="Arial" w:hAnsi="Arial" w:cs="Arial"/>
+                <w:noProof/>
+                <w:webHidden/>
+              </w:rPr>
+              <w:t>5</w:t>
+            </w:r>
+            <w:r>
+              <w:rPr>
+                <w:rFonts w:ascii="Arial" w:hAnsi="Arial" w:cs="Arial"/>
+                <w:noProof/>
+                <w:webHidden/>
+              </w:rPr>
+              <w:fldChar w:fldCharType="end"/>
+            </w:r>
+          </w:hyperlink>
+        </w:p>
+        <w:p>
+          <w:pPr>
+            <w:pStyle w:val="Verzeichnis2"/>
+            <w:tabs>
+              <w:tab w:val="left" w:pos="720"/>
+              <w:tab w:val="right" w:leader="dot" w:pos="9062"/>
+            </w:tabs>
+            <w:rPr>
+              <w:rFonts w:ascii="Arial" w:eastAsiaTheme="minorEastAsia" w:hAnsi="Arial" w:cs="Arial"/>
+              <w:noProof/>
+              <w:lang w:eastAsia="de-DE"/>
+            </w:rPr>
+          </w:pPr>
+          <w:hyperlink w:anchor="_Toc240287887" w:history="1">
+            <w:r>
+              <w:rPr>
+                <w:rStyle w:val="Hyperlink"/>
+                <w:rFonts w:ascii="Arial" w:hAnsi="Arial" w:cs="Arial"/>
+                <w:noProof/>
+              </w:rPr>
+              <w:t></w:t>
+            </w:r>
+            <w:r>
+              <w:rPr>
+                <w:rFonts w:ascii="Arial" w:eastAsiaTheme="minorEastAsia" w:hAnsi="Arial" w:cs="Arial"/>
+                <w:noProof/>
+                <w:lang w:eastAsia="de-DE"/>
+              </w:rPr>
+              <w:tab/>
+            </w:r>
+            <w:r>
+              <w:rPr>
+                <w:rStyle w:val="Hyperlink"/>
+                <w:rFonts w:ascii="Arial" w:hAnsi="Arial" w:cs="Arial"/>
+                <w:noProof/>
+              </w:rPr>
+              <w:t>Wissensbegrenzungen</w:t>
+            </w:r>
+            <w:r>
+              <w:rPr>
+                <w:rFonts w:ascii="Arial" w:hAnsi="Arial" w:cs="Arial"/>
+                <w:noProof/>
+                <w:webHidden/>
+              </w:rPr>
+              <w:tab/>
+            </w:r>
+            <w:r>
+              <w:rPr>
+                <w:rFonts w:ascii="Arial" w:hAnsi="Arial" w:cs="Arial"/>
+                <w:noProof/>
+                <w:webHidden/>
+              </w:rPr>
+              <w:fldChar w:fldCharType="begin"/>
+            </w:r>
+            <w:r>
+              <w:rPr>
+                <w:rFonts w:ascii="Arial" w:hAnsi="Arial" w:cs="Arial"/>
+                <w:noProof/>
+                <w:webHidden/>
+              </w:rPr>
+              <w:instrText xml:space="preserve"> PAGEREF _Toc240287887 \h </w:instrText>
+            </w:r>
+            <w:r>
+              <w:rPr>
+                <w:rFonts w:ascii="Arial" w:hAnsi="Arial" w:cs="Arial"/>
+                <w:noProof/>
+                <w:webHidden/>
+              </w:rPr>
+            </w:r>
+            <w:r>
+              <w:rPr>
+                <w:rFonts w:ascii="Arial" w:hAnsi="Arial" w:cs="Arial"/>
+                <w:noProof/>
+                <w:webHidden/>
+              </w:rPr>
+              <w:fldChar w:fldCharType="separate"/>
+            </w:r>
+            <w:r>
+              <w:rPr>
+                <w:rFonts w:ascii="Arial" w:hAnsi="Arial" w:cs="Arial"/>
+                <w:noProof/>
+                <w:webHidden/>
+              </w:rPr>
+              <w:t>5</w:t>
+            </w:r>
+            <w:r>
+              <w:rPr>
+                <w:rFonts w:ascii="Arial" w:hAnsi="Arial" w:cs="Arial"/>
+                <w:noProof/>
+                <w:webHidden/>
+              </w:rPr>
+              <w:fldChar w:fldCharType="end"/>
+            </w:r>
+          </w:hyperlink>
+        </w:p>
+        <w:p>
+          <w:pPr>
+            <w:pStyle w:val="Verzeichnis2"/>
+            <w:tabs>
+              <w:tab w:val="left" w:pos="720"/>
+              <w:tab w:val="right" w:leader="dot" w:pos="9062"/>
+            </w:tabs>
+            <w:rPr>
+              <w:rFonts w:ascii="Arial" w:eastAsiaTheme="minorEastAsia" w:hAnsi="Arial" w:cs="Arial"/>
+              <w:noProof/>
+              <w:lang w:eastAsia="de-DE"/>
+            </w:rPr>
+          </w:pPr>
+          <w:hyperlink w:anchor="_Toc240287888" w:history="1">
+            <w:r>
+              <w:rPr>
+                <w:rStyle w:val="Hyperlink"/>
+                <w:rFonts w:ascii="Arial" w:hAnsi="Arial" w:cs="Arial"/>
+                <w:noProof/>
+              </w:rPr>
+              <w:t></w:t>
+            </w:r>
+            <w:r>
+              <w:rPr>
+                <w:rFonts w:ascii="Arial" w:eastAsiaTheme="minorEastAsia" w:hAnsi="Arial" w:cs="Arial"/>
+                <w:noProof/>
+                <w:lang w:eastAsia="de-DE"/>
+              </w:rPr>
+              <w:tab/>
+            </w:r>
+            <w:r>
+              <w:rPr>
+                <w:rStyle w:val="Hyperlink"/>
+                <w:rFonts w:ascii="Arial" w:hAnsi="Arial" w:cs="Arial"/>
+                <w:noProof/>
+              </w:rPr>
+              <w:t>Kosten</w:t>
+            </w:r>
+            <w:r>
+              <w:rPr>
+                <w:rFonts w:ascii="Arial" w:hAnsi="Arial" w:cs="Arial"/>
+                <w:noProof/>
+                <w:webHidden/>
+              </w:rPr>
+              <w:tab/>
+            </w:r>
+            <w:r>
+              <w:rPr>
+                <w:rFonts w:ascii="Arial" w:hAnsi="Arial" w:cs="Arial"/>
+                <w:noProof/>
+                <w:webHidden/>
+              </w:rPr>
+              <w:fldChar w:fldCharType="begin"/>
+            </w:r>
+            <w:r>
+              <w:rPr>
+                <w:rFonts w:ascii="Arial" w:hAnsi="Arial" w:cs="Arial"/>
+                <w:noProof/>
+                <w:webHidden/>
+              </w:rPr>
+              <w:instrText xml:space="preserve"> PAGEREF _Toc240287888 \h </w:instrText>
+            </w:r>
+            <w:r>
+              <w:rPr>
+                <w:rFonts w:ascii="Arial" w:hAnsi="Arial" w:cs="Arial"/>
+                <w:noProof/>
+                <w:webHidden/>
+              </w:rPr>
+            </w:r>
+            <w:r>
+              <w:rPr>
+                <w:rFonts w:ascii="Arial" w:hAnsi="Arial" w:cs="Arial"/>
+                <w:noProof/>
+                <w:webHidden/>
+              </w:rPr>
+              <w:fldChar w:fldCharType="separate"/>
+            </w:r>
+            <w:r>
+              <w:rPr>
+                <w:rFonts w:ascii="Arial" w:hAnsi="Arial" w:cs="Arial"/>
+                <w:noProof/>
+                <w:webHidden/>
+              </w:rPr>
+              <w:t>5</w:t>
+            </w:r>
+            <w:r>
+              <w:rPr>
+                <w:rFonts w:ascii="Arial" w:hAnsi="Arial" w:cs="Arial"/>
+                <w:noProof/>
+                <w:webHidden/>
+              </w:rPr>
+              <w:fldChar w:fldCharType="end"/>
+            </w:r>
+          </w:hyperlink>
+        </w:p>
+        <w:p>
+          <w:pPr>
+            <w:pStyle w:val="Verzeichnis2"/>
+            <w:tabs>
+              <w:tab w:val="left" w:pos="720"/>
+              <w:tab w:val="right" w:leader="dot" w:pos="9062"/>
+            </w:tabs>
+            <w:rPr>
+              <w:rFonts w:ascii="Arial" w:eastAsiaTheme="minorEastAsia" w:hAnsi="Arial" w:cs="Arial"/>
+              <w:noProof/>
+              <w:lang w:eastAsia="de-DE"/>
+            </w:rPr>
+          </w:pPr>
+          <w:hyperlink w:anchor="_Toc240287889" w:history="1">
+            <w:r>
+              <w:rPr>
+                <w:rStyle w:val="Hyperlink"/>
+                <w:rFonts w:ascii="Arial" w:hAnsi="Arial" w:cs="Arial"/>
+                <w:noProof/>
+              </w:rPr>
+              <w:t></w:t>
+            </w:r>
+            <w:r>
+              <w:rPr>
+                <w:rFonts w:ascii="Arial" w:eastAsiaTheme="minorEastAsia" w:hAnsi="Arial" w:cs="Arial"/>
+                <w:noProof/>
+                <w:lang w:eastAsia="de-DE"/>
+              </w:rPr>
+              <w:tab/>
+            </w:r>
+            <w:r>
+              <w:rPr>
+                <w:rStyle w:val="Hyperlink"/>
+                <w:rFonts w:ascii="Arial" w:hAnsi="Arial" w:cs="Arial"/>
+                <w:noProof/>
+              </w:rPr>
+              <w:t>Hardwaregrenzen</w:t>
+            </w:r>
+            <w:r>
+              <w:rPr>
+                <w:rFonts w:ascii="Arial" w:hAnsi="Arial" w:cs="Arial"/>
+                <w:noProof/>
+                <w:webHidden/>
+              </w:rPr>
+              <w:tab/>
+            </w:r>
+            <w:r>
+              <w:rPr>
+                <w:rFonts w:ascii="Arial" w:hAnsi="Arial" w:cs="Arial"/>
+                <w:noProof/>
+                <w:webHidden/>
+              </w:rPr>
+              <w:fldChar w:fldCharType="begin"/>
+            </w:r>
+            <w:r>
+              <w:rPr>
+                <w:rFonts w:ascii="Arial" w:hAnsi="Arial" w:cs="Arial"/>
+                <w:noProof/>
+                <w:webHidden/>
+              </w:rPr>
+              <w:instrText xml:space="preserve"> PAGEREF _Toc240287889 \h </w:instrText>
+            </w:r>
+            <w:r>
+              <w:rPr>
+                <w:rFonts w:ascii="Arial" w:hAnsi="Arial" w:cs="Arial"/>
+                <w:noProof/>
+                <w:webHidden/>
+              </w:rPr>
+            </w:r>
+            <w:r>
+              <w:rPr>
+                <w:rFonts w:ascii="Arial" w:hAnsi="Arial" w:cs="Arial"/>
+                <w:noProof/>
+                <w:webHidden/>
+              </w:rPr>
+              <w:fldChar w:fldCharType="separate"/>
+            </w:r>
+            <w:r>
+              <w:rPr>
+                <w:rFonts w:ascii="Arial" w:hAnsi="Arial" w:cs="Arial"/>
+                <w:noProof/>
+                <w:webHidden/>
+              </w:rPr>
+              <w:t>5</w:t>
+            </w:r>
+            <w:r>
+              <w:rPr>
+                <w:rFonts w:ascii="Arial" w:hAnsi="Arial" w:cs="Arial"/>
+                <w:noProof/>
+                <w:webHidden/>
+              </w:rPr>
+              <w:fldChar w:fldCharType="end"/>
+            </w:r>
+          </w:hyperlink>
+        </w:p>
+        <w:p>
+          <w:pPr>
+            <w:pStyle w:val="Verzeichnis2"/>
+            <w:tabs>
+              <w:tab w:val="left" w:pos="720"/>
+              <w:tab w:val="right" w:leader="dot" w:pos="9062"/>
+            </w:tabs>
+            <w:rPr>
+              <w:rFonts w:ascii="Arial" w:eastAsiaTheme="minorEastAsia" w:hAnsi="Arial" w:cs="Arial"/>
+              <w:noProof/>
+              <w:lang w:eastAsia="de-DE"/>
+            </w:rPr>
+          </w:pPr>
+          <w:hyperlink w:anchor="_Toc240287890" w:history="1">
+            <w:r>
+              <w:rPr>
+                <w:rStyle w:val="Hyperlink"/>
+                <w:rFonts w:ascii="Arial" w:hAnsi="Arial" w:cs="Arial"/>
+                <w:noProof/>
+              </w:rPr>
+              <w:t></w:t>
+            </w:r>
+            <w:r>
+              <w:rPr>
+                <w:rFonts w:ascii="Arial" w:eastAsiaTheme="minorEastAsia" w:hAnsi="Arial" w:cs="Arial"/>
+                <w:noProof/>
+                <w:lang w:eastAsia="de-DE"/>
+              </w:rPr>
+              <w:tab/>
+            </w:r>
+            <w:r>
+              <w:rPr>
+                <w:rStyle w:val="Hyperlink"/>
+                <w:rFonts w:ascii="Arial" w:hAnsi="Arial" w:cs="Arial"/>
+                <w:noProof/>
+              </w:rPr>
+              <w:t>Softwaregrenzen</w:t>
+            </w:r>
+            <w:r>
+              <w:rPr>
+                <w:rFonts w:ascii="Arial" w:hAnsi="Arial" w:cs="Arial"/>
+                <w:noProof/>
+                <w:webHidden/>
+              </w:rPr>
+              <w:tab/>
+            </w:r>
+            <w:r>
+              <w:rPr>
+                <w:rFonts w:ascii="Arial" w:hAnsi="Arial" w:cs="Arial"/>
+                <w:noProof/>
+                <w:webHidden/>
+              </w:rPr>
+              <w:fldChar w:fldCharType="begin"/>
+            </w:r>
+            <w:r>
+              <w:rPr>
+                <w:rFonts w:ascii="Arial" w:hAnsi="Arial" w:cs="Arial"/>
+                <w:noProof/>
+                <w:webHidden/>
+              </w:rPr>
+              <w:instrText xml:space="preserve"> PAGEREF _Toc240287890 \h </w:instrText>
+            </w:r>
+            <w:r>
+              <w:rPr>
+                <w:rFonts w:ascii="Arial" w:hAnsi="Arial" w:cs="Arial"/>
+                <w:noProof/>
+                <w:webHidden/>
+              </w:rPr>
+            </w:r>
+            <w:r>
+              <w:rPr>
+                <w:rFonts w:ascii="Arial" w:hAnsi="Arial" w:cs="Arial"/>
+                <w:noProof/>
+                <w:webHidden/>
+              </w:rPr>
+              <w:fldChar w:fldCharType="separate"/>
+            </w:r>
+            <w:r>
+              <w:rPr>
+                <w:rFonts w:ascii="Arial" w:hAnsi="Arial" w:cs="Arial"/>
+                <w:noProof/>
+                <w:webHidden/>
+              </w:rPr>
+              <w:t>5</w:t>
+            </w:r>
+            <w:r>
+              <w:rPr>
+                <w:rFonts w:ascii="Arial" w:hAnsi="Arial" w:cs="Arial"/>
                 <w:noProof/>
                 <w:webHidden/>
               </w:rPr>
@@ -313,22 +1191,23 @@
               <w:tab w:val="right" w:leader="dot" w:pos="9062"/>
             </w:tabs>
             <w:rPr>
-              <w:rFonts w:eastAsiaTheme="minorEastAsia"/>
+              <w:rFonts w:ascii="Arial" w:eastAsiaTheme="minorEastAsia" w:hAnsi="Arial" w:cs="Arial"/>
               <w:noProof/>
               <w:lang w:eastAsia="de-DE"/>
             </w:rPr>
           </w:pPr>
-          <w:hyperlink w:anchor="_Toc240022159" w:history="1">
+          <w:hyperlink w:anchor="_Toc240287891" w:history="1">
             <w:r>
               <w:rPr>
                 <w:rStyle w:val="Hyperlink"/>
-                <w:rFonts w:cs="Arial"/>
-                <w:noProof/>
-              </w:rPr>
-              <w:t>Welche möglichen Probleme oder Nachteile könnten entstehen?</w:t>
-            </w:r>
-            <w:r>
-              <w:rPr>
+                <w:rFonts w:ascii="Arial" w:hAnsi="Arial" w:cs="Arial"/>
+                <w:noProof/>
+              </w:rPr>
+              <w:t>3) Hardware</w:t>
+            </w:r>
+            <w:r>
+              <w:rPr>
+                <w:rFonts w:ascii="Arial" w:hAnsi="Arial" w:cs="Arial"/>
                 <w:noProof/>
                 <w:webHidden/>
               </w:rPr>
@@ -336,6 +1215,7 @@
             </w:r>
             <w:r>
               <w:rPr>
+                <w:rFonts w:ascii="Arial" w:hAnsi="Arial" w:cs="Arial"/>
                 <w:noProof/>
                 <w:webHidden/>
               </w:rPr>
@@ -343,19 +1223,22 @@
             </w:r>
             <w:r>
               <w:rPr>
-                <w:noProof/>
-                <w:webHidden/>
-              </w:rPr>
-              <w:instrText xml:space="preserve"> PAGEREF _Toc240022159 \h </w:instrText>
-            </w:r>
-            <w:r>
-              <w:rPr>
-                <w:noProof/>
-                <w:webHidden/>
-              </w:rPr>
-            </w:r>
-            <w:r>
-              <w:rPr>
+                <w:rFonts w:ascii="Arial" w:hAnsi="Arial" w:cs="Arial"/>
+                <w:noProof/>
+                <w:webHidden/>
+              </w:rPr>
+              <w:instrText xml:space="preserve"> PAGEREF _Toc240287891 \h </w:instrText>
+            </w:r>
+            <w:r>
+              <w:rPr>
+                <w:rFonts w:ascii="Arial" w:hAnsi="Arial" w:cs="Arial"/>
+                <w:noProof/>
+                <w:webHidden/>
+              </w:rPr>
+            </w:r>
+            <w:r>
+              <w:rPr>
+                <w:rFonts w:ascii="Arial" w:hAnsi="Arial" w:cs="Arial"/>
                 <w:noProof/>
                 <w:webHidden/>
               </w:rPr>
@@ -363,13 +1246,15 @@
             </w:r>
             <w:r>
               <w:rPr>
-                <w:noProof/>
-                <w:webHidden/>
-              </w:rPr>
-              <w:t>3</w:t>
-            </w:r>
-            <w:r>
-              <w:rPr>
+                <w:rFonts w:ascii="Arial" w:hAnsi="Arial" w:cs="Arial"/>
+                <w:noProof/>
+                <w:webHidden/>
+              </w:rPr>
+              <w:t>6</w:t>
+            </w:r>
+            <w:r>
+              <w:rPr>
+                <w:rFonts w:ascii="Arial" w:hAnsi="Arial" w:cs="Arial"/>
                 <w:noProof/>
                 <w:webHidden/>
               </w:rPr>
@@ -379,34 +1264,53 @@
         </w:p>
         <w:p>
           <w:pPr>
-            <w:pStyle w:val="Verzeichnis1"/>
+            <w:pStyle w:val="Verzeichnis2"/>
             <w:tabs>
+              <w:tab w:val="left" w:pos="720"/>
               <w:tab w:val="right" w:leader="dot" w:pos="9062"/>
             </w:tabs>
             <w:rPr>
-              <w:rFonts w:eastAsiaTheme="minorEastAsia"/>
+              <w:rFonts w:ascii="Arial" w:eastAsiaTheme="minorEastAsia" w:hAnsi="Arial" w:cs="Arial"/>
               <w:noProof/>
               <w:lang w:eastAsia="de-DE"/>
             </w:rPr>
           </w:pPr>
-          <w:hyperlink w:anchor="_Toc240022160" w:history="1">
+          <w:hyperlink w:anchor="_Toc240287892" w:history="1">
             <w:r>
               <w:rPr>
                 <w:rStyle w:val="Hyperlink"/>
-                <w:rFonts w:cs="Arial"/>
-                <w:noProof/>
-              </w:rPr>
-              <w:t>Welche Geräte/ Ablagesysteme gibt es bereits?</w:t>
-            </w:r>
-            <w:r>
-              <w:rPr>
-                <w:noProof/>
-                <w:webHidden/>
+                <w:rFonts w:ascii="Arial" w:hAnsi="Arial" w:cs="Arial"/>
+                <w:noProof/>
+              </w:rPr>
+              <w:t></w:t>
+            </w:r>
+            <w:r>
+              <w:rPr>
+                <w:rFonts w:ascii="Arial" w:eastAsiaTheme="minorEastAsia" w:hAnsi="Arial" w:cs="Arial"/>
+                <w:noProof/>
+                <w:lang w:eastAsia="de-DE"/>
               </w:rPr>
               <w:tab/>
             </w:r>
             <w:r>
               <w:rPr>
+                <w:rStyle w:val="Hyperlink"/>
+                <w:rFonts w:ascii="Arial" w:hAnsi="Arial" w:cs="Arial"/>
+                <w:noProof/>
+              </w:rPr>
+              <w:t>Teile die zu verbauen sind</w:t>
+            </w:r>
+            <w:r>
+              <w:rPr>
+                <w:rFonts w:ascii="Arial" w:hAnsi="Arial" w:cs="Arial"/>
+                <w:noProof/>
+                <w:webHidden/>
+              </w:rPr>
+              <w:tab/>
+            </w:r>
+            <w:r>
+              <w:rPr>
+                <w:rFonts w:ascii="Arial" w:hAnsi="Arial" w:cs="Arial"/>
                 <w:noProof/>
                 <w:webHidden/>
               </w:rPr>
@@ -414,19 +1318,22 @@
             </w:r>
             <w:r>
               <w:rPr>
-                <w:noProof/>
-                <w:webHidden/>
-              </w:rPr>
-              <w:instrText xml:space="preserve"> PAGEREF _Toc240022160 \h </w:instrText>
-            </w:r>
-            <w:r>
-              <w:rPr>
-                <w:noProof/>
-                <w:webHidden/>
-              </w:rPr>
-            </w:r>
-            <w:r>
-              <w:rPr>
+                <w:rFonts w:ascii="Arial" w:hAnsi="Arial" w:cs="Arial"/>
+                <w:noProof/>
+                <w:webHidden/>
+              </w:rPr>
+              <w:instrText xml:space="preserve"> PAGEREF _Toc240287892 \h </w:instrText>
+            </w:r>
+            <w:r>
+              <w:rPr>
+                <w:rFonts w:ascii="Arial" w:hAnsi="Arial" w:cs="Arial"/>
+                <w:noProof/>
+                <w:webHidden/>
+              </w:rPr>
+            </w:r>
+            <w:r>
+              <w:rPr>
+                <w:rFonts w:ascii="Arial" w:hAnsi="Arial" w:cs="Arial"/>
                 <w:noProof/>
                 <w:webHidden/>
               </w:rPr>
@@ -434,13 +1341,15 @@
             </w:r>
             <w:r>
               <w:rPr>
-                <w:noProof/>
-                <w:webHidden/>
-              </w:rPr>
-              <w:t>3</w:t>
-            </w:r>
-            <w:r>
-              <w:rPr>
+                <w:rFonts w:ascii="Arial" w:hAnsi="Arial" w:cs="Arial"/>
+                <w:noProof/>
+                <w:webHidden/>
+              </w:rPr>
+              <w:t>6</w:t>
+            </w:r>
+            <w:r>
+              <w:rPr>
+                <w:rFonts w:ascii="Arial" w:hAnsi="Arial" w:cs="Arial"/>
                 <w:noProof/>
                 <w:webHidden/>
               </w:rPr>
@@ -450,34 +1359,53 @@
         </w:p>
         <w:p>
           <w:pPr>
-            <w:pStyle w:val="Verzeichnis1"/>
+            <w:pStyle w:val="Verzeichnis2"/>
             <w:tabs>
+              <w:tab w:val="left" w:pos="720"/>
               <w:tab w:val="right" w:leader="dot" w:pos="9062"/>
             </w:tabs>
             <w:rPr>
-              <w:rFonts w:eastAsiaTheme="minorEastAsia"/>
+              <w:rFonts w:ascii="Arial" w:eastAsiaTheme="minorEastAsia" w:hAnsi="Arial" w:cs="Arial"/>
               <w:noProof/>
               <w:lang w:eastAsia="de-DE"/>
             </w:rPr>
           </w:pPr>
-          <w:hyperlink w:anchor="_Toc240022161" w:history="1">
+          <w:hyperlink w:anchor="_Toc240287893" w:history="1">
             <w:r>
               <w:rPr>
                 <w:rStyle w:val="Hyperlink"/>
-                <w:rFonts w:cs="Arial"/>
-                <w:noProof/>
-              </w:rPr>
-              <w:t>Welche technischen Möglichkeiten (Werkzeuge, Material, etc.) können für das Konzept herangezogen werden?</w:t>
-            </w:r>
-            <w:r>
-              <w:rPr>
-                <w:noProof/>
-                <w:webHidden/>
+                <w:rFonts w:ascii="Arial" w:hAnsi="Arial" w:cs="Arial"/>
+                <w:noProof/>
+              </w:rPr>
+              <w:t>o</w:t>
+            </w:r>
+            <w:r>
+              <w:rPr>
+                <w:rFonts w:ascii="Arial" w:eastAsiaTheme="minorEastAsia" w:hAnsi="Arial" w:cs="Arial"/>
+                <w:noProof/>
+                <w:lang w:eastAsia="de-DE"/>
               </w:rPr>
               <w:tab/>
             </w:r>
             <w:r>
               <w:rPr>
+                <w:rStyle w:val="Hyperlink"/>
+                <w:rFonts w:ascii="Arial" w:hAnsi="Arial" w:cs="Arial"/>
+                <w:noProof/>
+              </w:rPr>
+              <w:t>Registrieren des Handys:</w:t>
+            </w:r>
+            <w:r>
+              <w:rPr>
+                <w:rFonts w:ascii="Arial" w:hAnsi="Arial" w:cs="Arial"/>
+                <w:noProof/>
+                <w:webHidden/>
+              </w:rPr>
+              <w:tab/>
+            </w:r>
+            <w:r>
+              <w:rPr>
+                <w:rFonts w:ascii="Arial" w:hAnsi="Arial" w:cs="Arial"/>
                 <w:noProof/>
                 <w:webHidden/>
               </w:rPr>
@@ -485,19 +1413,22 @@
             </w:r>
             <w:r>
               <w:rPr>
-                <w:noProof/>
-                <w:webHidden/>
-              </w:rPr>
-              <w:instrText xml:space="preserve"> PAGEREF _Toc240022161 \h </w:instrText>
-            </w:r>
-            <w:r>
-              <w:rPr>
-                <w:noProof/>
-                <w:webHidden/>
-              </w:rPr>
-            </w:r>
-            <w:r>
-              <w:rPr>
+                <w:rFonts w:ascii="Arial" w:hAnsi="Arial" w:cs="Arial"/>
+                <w:noProof/>
+                <w:webHidden/>
+              </w:rPr>
+              <w:instrText xml:space="preserve"> PAGEREF _Toc240287893 \h </w:instrText>
+            </w:r>
+            <w:r>
+              <w:rPr>
+                <w:rFonts w:ascii="Arial" w:hAnsi="Arial" w:cs="Arial"/>
+                <w:noProof/>
+                <w:webHidden/>
+              </w:rPr>
+            </w:r>
+            <w:r>
+              <w:rPr>
+                <w:rFonts w:ascii="Arial" w:hAnsi="Arial" w:cs="Arial"/>
                 <w:noProof/>
                 <w:webHidden/>
               </w:rPr>
@@ -505,13 +1436,587 @@
             </w:r>
             <w:r>
               <w:rPr>
-                <w:noProof/>
-                <w:webHidden/>
-              </w:rPr>
-              <w:t>4</w:t>
-            </w:r>
-            <w:r>
-              <w:rPr>
+                <w:rFonts w:ascii="Arial" w:hAnsi="Arial" w:cs="Arial"/>
+                <w:noProof/>
+                <w:webHidden/>
+              </w:rPr>
+              <w:t>6</w:t>
+            </w:r>
+            <w:r>
+              <w:rPr>
+                <w:rFonts w:ascii="Arial" w:hAnsi="Arial" w:cs="Arial"/>
+                <w:noProof/>
+                <w:webHidden/>
+              </w:rPr>
+              <w:fldChar w:fldCharType="end"/>
+            </w:r>
+          </w:hyperlink>
+        </w:p>
+        <w:p>
+          <w:pPr>
+            <w:pStyle w:val="Verzeichnis2"/>
+            <w:tabs>
+              <w:tab w:val="left" w:pos="720"/>
+              <w:tab w:val="right" w:leader="dot" w:pos="9062"/>
+            </w:tabs>
+            <w:rPr>
+              <w:rFonts w:ascii="Arial" w:eastAsiaTheme="minorEastAsia" w:hAnsi="Arial" w:cs="Arial"/>
+              <w:noProof/>
+              <w:lang w:eastAsia="de-DE"/>
+            </w:rPr>
+          </w:pPr>
+          <w:hyperlink w:anchor="_Toc240287894" w:history="1">
+            <w:r>
+              <w:rPr>
+                <w:rStyle w:val="Hyperlink"/>
+                <w:rFonts w:ascii="Arial" w:hAnsi="Arial" w:cs="Arial"/>
+                <w:noProof/>
+              </w:rPr>
+              <w:t></w:t>
+            </w:r>
+            <w:r>
+              <w:rPr>
+                <w:rFonts w:ascii="Arial" w:eastAsiaTheme="minorEastAsia" w:hAnsi="Arial" w:cs="Arial"/>
+                <w:noProof/>
+                <w:lang w:eastAsia="de-DE"/>
+              </w:rPr>
+              <w:tab/>
+            </w:r>
+            <w:r>
+              <w:rPr>
+                <w:rStyle w:val="Hyperlink"/>
+                <w:rFonts w:ascii="Arial" w:hAnsi="Arial" w:cs="Arial"/>
+                <w:noProof/>
+              </w:rPr>
+              <w:t>Steuerelement</w:t>
+            </w:r>
+            <w:r>
+              <w:rPr>
+                <w:rFonts w:ascii="Arial" w:hAnsi="Arial" w:cs="Arial"/>
+                <w:noProof/>
+                <w:webHidden/>
+              </w:rPr>
+              <w:tab/>
+            </w:r>
+            <w:r>
+              <w:rPr>
+                <w:rFonts w:ascii="Arial" w:hAnsi="Arial" w:cs="Arial"/>
+                <w:noProof/>
+                <w:webHidden/>
+              </w:rPr>
+              <w:fldChar w:fldCharType="begin"/>
+            </w:r>
+            <w:r>
+              <w:rPr>
+                <w:rFonts w:ascii="Arial" w:hAnsi="Arial" w:cs="Arial"/>
+                <w:noProof/>
+                <w:webHidden/>
+              </w:rPr>
+              <w:instrText xml:space="preserve"> PAGEREF _Toc240287894 \h </w:instrText>
+            </w:r>
+            <w:r>
+              <w:rPr>
+                <w:rFonts w:ascii="Arial" w:hAnsi="Arial" w:cs="Arial"/>
+                <w:noProof/>
+                <w:webHidden/>
+              </w:rPr>
+            </w:r>
+            <w:r>
+              <w:rPr>
+                <w:rFonts w:ascii="Arial" w:hAnsi="Arial" w:cs="Arial"/>
+                <w:noProof/>
+                <w:webHidden/>
+              </w:rPr>
+              <w:fldChar w:fldCharType="separate"/>
+            </w:r>
+            <w:r>
+              <w:rPr>
+                <w:rFonts w:ascii="Arial" w:hAnsi="Arial" w:cs="Arial"/>
+                <w:noProof/>
+                <w:webHidden/>
+              </w:rPr>
+              <w:t>6</w:t>
+            </w:r>
+            <w:r>
+              <w:rPr>
+                <w:rFonts w:ascii="Arial" w:hAnsi="Arial" w:cs="Arial"/>
+                <w:noProof/>
+                <w:webHidden/>
+              </w:rPr>
+              <w:fldChar w:fldCharType="end"/>
+            </w:r>
+          </w:hyperlink>
+        </w:p>
+        <w:p>
+          <w:pPr>
+            <w:pStyle w:val="Verzeichnis2"/>
+            <w:tabs>
+              <w:tab w:val="left" w:pos="720"/>
+              <w:tab w:val="right" w:leader="dot" w:pos="9062"/>
+            </w:tabs>
+            <w:rPr>
+              <w:rFonts w:ascii="Arial" w:eastAsiaTheme="minorEastAsia" w:hAnsi="Arial" w:cs="Arial"/>
+              <w:noProof/>
+              <w:lang w:eastAsia="de-DE"/>
+            </w:rPr>
+          </w:pPr>
+          <w:hyperlink w:anchor="_Toc240287895" w:history="1">
+            <w:r>
+              <w:rPr>
+                <w:rStyle w:val="Hyperlink"/>
+                <w:rFonts w:ascii="Arial" w:hAnsi="Arial" w:cs="Arial"/>
+                <w:noProof/>
+              </w:rPr>
+              <w:t></w:t>
+            </w:r>
+            <w:r>
+              <w:rPr>
+                <w:rFonts w:ascii="Arial" w:eastAsiaTheme="minorEastAsia" w:hAnsi="Arial" w:cs="Arial"/>
+                <w:noProof/>
+                <w:lang w:eastAsia="de-DE"/>
+              </w:rPr>
+              <w:tab/>
+            </w:r>
+            <w:r>
+              <w:rPr>
+                <w:rStyle w:val="Hyperlink"/>
+                <w:rFonts w:ascii="Arial" w:hAnsi="Arial" w:cs="Arial"/>
+                <w:noProof/>
+              </w:rPr>
+              <w:t>Temperaturmesser</w:t>
+            </w:r>
+            <w:r>
+              <w:rPr>
+                <w:rFonts w:ascii="Arial" w:hAnsi="Arial" w:cs="Arial"/>
+                <w:noProof/>
+                <w:webHidden/>
+              </w:rPr>
+              <w:tab/>
+            </w:r>
+            <w:r>
+              <w:rPr>
+                <w:rFonts w:ascii="Arial" w:hAnsi="Arial" w:cs="Arial"/>
+                <w:noProof/>
+                <w:webHidden/>
+              </w:rPr>
+              <w:fldChar w:fldCharType="begin"/>
+            </w:r>
+            <w:r>
+              <w:rPr>
+                <w:rFonts w:ascii="Arial" w:hAnsi="Arial" w:cs="Arial"/>
+                <w:noProof/>
+                <w:webHidden/>
+              </w:rPr>
+              <w:instrText xml:space="preserve"> PAGEREF _Toc240287895 \h </w:instrText>
+            </w:r>
+            <w:r>
+              <w:rPr>
+                <w:rFonts w:ascii="Arial" w:hAnsi="Arial" w:cs="Arial"/>
+                <w:noProof/>
+                <w:webHidden/>
+              </w:rPr>
+            </w:r>
+            <w:r>
+              <w:rPr>
+                <w:rFonts w:ascii="Arial" w:hAnsi="Arial" w:cs="Arial"/>
+                <w:noProof/>
+                <w:webHidden/>
+              </w:rPr>
+              <w:fldChar w:fldCharType="separate"/>
+            </w:r>
+            <w:r>
+              <w:rPr>
+                <w:rFonts w:ascii="Arial" w:hAnsi="Arial" w:cs="Arial"/>
+                <w:noProof/>
+                <w:webHidden/>
+              </w:rPr>
+              <w:t>6</w:t>
+            </w:r>
+            <w:r>
+              <w:rPr>
+                <w:rFonts w:ascii="Arial" w:hAnsi="Arial" w:cs="Arial"/>
+                <w:noProof/>
+                <w:webHidden/>
+              </w:rPr>
+              <w:fldChar w:fldCharType="end"/>
+            </w:r>
+          </w:hyperlink>
+        </w:p>
+        <w:p>
+          <w:pPr>
+            <w:pStyle w:val="Verzeichnis2"/>
+            <w:tabs>
+              <w:tab w:val="left" w:pos="720"/>
+              <w:tab w:val="right" w:leader="dot" w:pos="9062"/>
+            </w:tabs>
+            <w:rPr>
+              <w:rFonts w:ascii="Arial" w:eastAsiaTheme="minorEastAsia" w:hAnsi="Arial" w:cs="Arial"/>
+              <w:noProof/>
+              <w:lang w:eastAsia="de-DE"/>
+            </w:rPr>
+          </w:pPr>
+          <w:hyperlink w:anchor="_Toc240287896" w:history="1">
+            <w:r>
+              <w:rPr>
+                <w:rStyle w:val="Hyperlink"/>
+                <w:rFonts w:ascii="Arial" w:hAnsi="Arial" w:cs="Arial"/>
+                <w:bCs/>
+                <w:noProof/>
+              </w:rPr>
+              <w:t></w:t>
+            </w:r>
+            <w:r>
+              <w:rPr>
+                <w:rFonts w:ascii="Arial" w:eastAsiaTheme="minorEastAsia" w:hAnsi="Arial" w:cs="Arial"/>
+                <w:noProof/>
+                <w:lang w:eastAsia="de-DE"/>
+              </w:rPr>
+              <w:tab/>
+            </w:r>
+            <w:r>
+              <w:rPr>
+                <w:rStyle w:val="Hyperlink"/>
+                <w:rFonts w:ascii="Arial" w:hAnsi="Arial" w:cs="Arial"/>
+                <w:noProof/>
+              </w:rPr>
+              <w:t>Darstellung</w:t>
+            </w:r>
+            <w:r>
+              <w:rPr>
+                <w:rFonts w:ascii="Arial" w:hAnsi="Arial" w:cs="Arial"/>
+                <w:noProof/>
+                <w:webHidden/>
+              </w:rPr>
+              <w:tab/>
+            </w:r>
+            <w:r>
+              <w:rPr>
+                <w:rFonts w:ascii="Arial" w:hAnsi="Arial" w:cs="Arial"/>
+                <w:noProof/>
+                <w:webHidden/>
+              </w:rPr>
+              <w:fldChar w:fldCharType="begin"/>
+            </w:r>
+            <w:r>
+              <w:rPr>
+                <w:rFonts w:ascii="Arial" w:hAnsi="Arial" w:cs="Arial"/>
+                <w:noProof/>
+                <w:webHidden/>
+              </w:rPr>
+              <w:instrText xml:space="preserve"> PAGEREF _Toc240287896 \h </w:instrText>
+            </w:r>
+            <w:r>
+              <w:rPr>
+                <w:rFonts w:ascii="Arial" w:hAnsi="Arial" w:cs="Arial"/>
+                <w:noProof/>
+                <w:webHidden/>
+              </w:rPr>
+            </w:r>
+            <w:r>
+              <w:rPr>
+                <w:rFonts w:ascii="Arial" w:hAnsi="Arial" w:cs="Arial"/>
+                <w:noProof/>
+                <w:webHidden/>
+              </w:rPr>
+              <w:fldChar w:fldCharType="separate"/>
+            </w:r>
+            <w:r>
+              <w:rPr>
+                <w:rFonts w:ascii="Arial" w:hAnsi="Arial" w:cs="Arial"/>
+                <w:noProof/>
+                <w:webHidden/>
+              </w:rPr>
+              <w:t>6</w:t>
+            </w:r>
+            <w:r>
+              <w:rPr>
+                <w:rFonts w:ascii="Arial" w:hAnsi="Arial" w:cs="Arial"/>
+                <w:noProof/>
+                <w:webHidden/>
+              </w:rPr>
+              <w:fldChar w:fldCharType="end"/>
+            </w:r>
+          </w:hyperlink>
+        </w:p>
+        <w:p>
+          <w:pPr>
+            <w:pStyle w:val="Verzeichnis2"/>
+            <w:tabs>
+              <w:tab w:val="left" w:pos="720"/>
+              <w:tab w:val="right" w:leader="dot" w:pos="9062"/>
+            </w:tabs>
+            <w:rPr>
+              <w:rFonts w:ascii="Arial" w:eastAsiaTheme="minorEastAsia" w:hAnsi="Arial" w:cs="Arial"/>
+              <w:noProof/>
+              <w:lang w:eastAsia="de-DE"/>
+            </w:rPr>
+          </w:pPr>
+          <w:hyperlink w:anchor="_Toc240287897" w:history="1">
+            <w:r>
+              <w:rPr>
+                <w:rStyle w:val="Hyperlink"/>
+                <w:rFonts w:ascii="Arial" w:hAnsi="Arial" w:cs="Arial"/>
+                <w:bCs/>
+                <w:noProof/>
+              </w:rPr>
+              <w:t></w:t>
+            </w:r>
+            <w:r>
+              <w:rPr>
+                <w:rFonts w:ascii="Arial" w:eastAsiaTheme="minorEastAsia" w:hAnsi="Arial" w:cs="Arial"/>
+                <w:noProof/>
+                <w:lang w:eastAsia="de-DE"/>
+              </w:rPr>
+              <w:tab/>
+            </w:r>
+            <w:r>
+              <w:rPr>
+                <w:rStyle w:val="Hyperlink"/>
+                <w:rFonts w:ascii="Arial" w:hAnsi="Arial" w:cs="Arial"/>
+                <w:noProof/>
+              </w:rPr>
+              <w:t>Stromversorgung</w:t>
+            </w:r>
+            <w:r>
+              <w:rPr>
+                <w:rFonts w:ascii="Arial" w:hAnsi="Arial" w:cs="Arial"/>
+                <w:noProof/>
+                <w:webHidden/>
+              </w:rPr>
+              <w:tab/>
+            </w:r>
+            <w:r>
+              <w:rPr>
+                <w:rFonts w:ascii="Arial" w:hAnsi="Arial" w:cs="Arial"/>
+                <w:noProof/>
+                <w:webHidden/>
+              </w:rPr>
+              <w:fldChar w:fldCharType="begin"/>
+            </w:r>
+            <w:r>
+              <w:rPr>
+                <w:rFonts w:ascii="Arial" w:hAnsi="Arial" w:cs="Arial"/>
+                <w:noProof/>
+                <w:webHidden/>
+              </w:rPr>
+              <w:instrText xml:space="preserve"> PAGEREF _Toc240287897 \h </w:instrText>
+            </w:r>
+            <w:r>
+              <w:rPr>
+                <w:rFonts w:ascii="Arial" w:hAnsi="Arial" w:cs="Arial"/>
+                <w:noProof/>
+                <w:webHidden/>
+              </w:rPr>
+            </w:r>
+            <w:r>
+              <w:rPr>
+                <w:rFonts w:ascii="Arial" w:hAnsi="Arial" w:cs="Arial"/>
+                <w:noProof/>
+                <w:webHidden/>
+              </w:rPr>
+              <w:fldChar w:fldCharType="separate"/>
+            </w:r>
+            <w:r>
+              <w:rPr>
+                <w:rFonts w:ascii="Arial" w:hAnsi="Arial" w:cs="Arial"/>
+                <w:noProof/>
+                <w:webHidden/>
+              </w:rPr>
+              <w:t>6</w:t>
+            </w:r>
+            <w:r>
+              <w:rPr>
+                <w:rFonts w:ascii="Arial" w:hAnsi="Arial" w:cs="Arial"/>
+                <w:noProof/>
+                <w:webHidden/>
+              </w:rPr>
+              <w:fldChar w:fldCharType="end"/>
+            </w:r>
+          </w:hyperlink>
+        </w:p>
+        <w:p>
+          <w:pPr>
+            <w:pStyle w:val="Verzeichnis2"/>
+            <w:tabs>
+              <w:tab w:val="left" w:pos="720"/>
+              <w:tab w:val="right" w:leader="dot" w:pos="9062"/>
+            </w:tabs>
+            <w:rPr>
+              <w:rFonts w:ascii="Arial" w:eastAsiaTheme="minorEastAsia" w:hAnsi="Arial" w:cs="Arial"/>
+              <w:noProof/>
+              <w:lang w:eastAsia="de-DE"/>
+            </w:rPr>
+          </w:pPr>
+          <w:hyperlink w:anchor="_Toc240287898" w:history="1">
+            <w:r>
+              <w:rPr>
+                <w:rStyle w:val="Hyperlink"/>
+                <w:rFonts w:ascii="Arial" w:hAnsi="Arial" w:cs="Arial"/>
+                <w:noProof/>
+              </w:rPr>
+              <w:t></w:t>
+            </w:r>
+            <w:r>
+              <w:rPr>
+                <w:rFonts w:ascii="Arial" w:eastAsiaTheme="minorEastAsia" w:hAnsi="Arial" w:cs="Arial"/>
+                <w:noProof/>
+                <w:lang w:eastAsia="de-DE"/>
+              </w:rPr>
+              <w:tab/>
+            </w:r>
+            <w:r>
+              <w:rPr>
+                <w:rStyle w:val="Hyperlink"/>
+                <w:rFonts w:ascii="Arial" w:hAnsi="Arial" w:cs="Arial"/>
+                <w:noProof/>
+              </w:rPr>
+              <w:t>Steuerung des Displays</w:t>
+            </w:r>
+            <w:r>
+              <w:rPr>
+                <w:rFonts w:ascii="Arial" w:hAnsi="Arial" w:cs="Arial"/>
+                <w:noProof/>
+                <w:webHidden/>
+              </w:rPr>
+              <w:tab/>
+            </w:r>
+            <w:r>
+              <w:rPr>
+                <w:rFonts w:ascii="Arial" w:hAnsi="Arial" w:cs="Arial"/>
+                <w:noProof/>
+                <w:webHidden/>
+              </w:rPr>
+              <w:fldChar w:fldCharType="begin"/>
+            </w:r>
+            <w:r>
+              <w:rPr>
+                <w:rFonts w:ascii="Arial" w:hAnsi="Arial" w:cs="Arial"/>
+                <w:noProof/>
+                <w:webHidden/>
+              </w:rPr>
+              <w:instrText xml:space="preserve"> PAGEREF _Toc240287898 \h </w:instrText>
+            </w:r>
+            <w:r>
+              <w:rPr>
+                <w:rFonts w:ascii="Arial" w:hAnsi="Arial" w:cs="Arial"/>
+                <w:noProof/>
+                <w:webHidden/>
+              </w:rPr>
+            </w:r>
+            <w:r>
+              <w:rPr>
+                <w:rFonts w:ascii="Arial" w:hAnsi="Arial" w:cs="Arial"/>
+                <w:noProof/>
+                <w:webHidden/>
+              </w:rPr>
+              <w:fldChar w:fldCharType="separate"/>
+            </w:r>
+            <w:r>
+              <w:rPr>
+                <w:rFonts w:ascii="Arial" w:hAnsi="Arial" w:cs="Arial"/>
+                <w:noProof/>
+                <w:webHidden/>
+              </w:rPr>
+              <w:t>6</w:t>
+            </w:r>
+            <w:r>
+              <w:rPr>
+                <w:rFonts w:ascii="Arial" w:hAnsi="Arial" w:cs="Arial"/>
+                <w:noProof/>
+                <w:webHidden/>
+              </w:rPr>
+              <w:fldChar w:fldCharType="end"/>
+            </w:r>
+          </w:hyperlink>
+        </w:p>
+        <w:p>
+          <w:pPr>
+            <w:pStyle w:val="Verzeichnis2"/>
+            <w:tabs>
+              <w:tab w:val="left" w:pos="720"/>
+              <w:tab w:val="right" w:leader="dot" w:pos="9062"/>
+            </w:tabs>
+            <w:rPr>
+              <w:rFonts w:ascii="Arial" w:eastAsiaTheme="minorEastAsia" w:hAnsi="Arial" w:cs="Arial"/>
+              <w:noProof/>
+              <w:lang w:eastAsia="de-DE"/>
+            </w:rPr>
+          </w:pPr>
+          <w:hyperlink w:anchor="_Toc240287899" w:history="1">
+            <w:r>
+              <w:rPr>
+                <w:rStyle w:val="Hyperlink"/>
+                <w:rFonts w:ascii="Arial" w:hAnsi="Arial" w:cs="Arial"/>
+                <w:noProof/>
+              </w:rPr>
+              <w:t></w:t>
+            </w:r>
+            <w:r>
+              <w:rPr>
+                <w:rFonts w:ascii="Arial" w:eastAsiaTheme="minorEastAsia" w:hAnsi="Arial" w:cs="Arial"/>
+                <w:noProof/>
+                <w:lang w:eastAsia="de-DE"/>
+              </w:rPr>
+              <w:tab/>
+            </w:r>
+            <w:r>
+              <w:rPr>
+                <w:rStyle w:val="Hyperlink"/>
+                <w:rFonts w:ascii="Arial" w:hAnsi="Arial" w:cs="Arial"/>
+                <w:noProof/>
+              </w:rPr>
+              <w:t>Strommessung:</w:t>
+            </w:r>
+            <w:r>
+              <w:rPr>
+                <w:rFonts w:ascii="Arial" w:hAnsi="Arial" w:cs="Arial"/>
+                <w:noProof/>
+                <w:webHidden/>
+              </w:rPr>
+              <w:tab/>
+            </w:r>
+            <w:r>
+              <w:rPr>
+                <w:rFonts w:ascii="Arial" w:hAnsi="Arial" w:cs="Arial"/>
+                <w:noProof/>
+                <w:webHidden/>
+              </w:rPr>
+              <w:fldChar w:fldCharType="begin"/>
+            </w:r>
+            <w:r>
+              <w:rPr>
+                <w:rFonts w:ascii="Arial" w:hAnsi="Arial" w:cs="Arial"/>
+                <w:noProof/>
+                <w:webHidden/>
+              </w:rPr>
+              <w:instrText xml:space="preserve"> PAGEREF _Toc240287899 \h </w:instrText>
+            </w:r>
+            <w:r>
+              <w:rPr>
+                <w:rFonts w:ascii="Arial" w:hAnsi="Arial" w:cs="Arial"/>
+                <w:noProof/>
+                <w:webHidden/>
+              </w:rPr>
+            </w:r>
+            <w:r>
+              <w:rPr>
+                <w:rFonts w:ascii="Arial" w:hAnsi="Arial" w:cs="Arial"/>
+                <w:noProof/>
+                <w:webHidden/>
+              </w:rPr>
+              <w:fldChar w:fldCharType="separate"/>
+            </w:r>
+            <w:r>
+              <w:rPr>
+                <w:rFonts w:ascii="Arial" w:hAnsi="Arial" w:cs="Arial"/>
+                <w:noProof/>
+                <w:webHidden/>
+              </w:rPr>
+              <w:t>6</w:t>
+            </w:r>
+            <w:r>
+              <w:rPr>
+                <w:rFonts w:ascii="Arial" w:hAnsi="Arial" w:cs="Arial"/>
                 <w:noProof/>
                 <w:webHidden/>
               </w:rPr>
@@ -551,20 +2056,51 @@
     </w:p>
     <w:p>
       <w:pPr>
+        <w:pStyle w:val="berschrift"/>
+        <w:jc w:val="center"/>
+        <w:rPr>
+          <w:rFonts w:cs="Arial"/>
+        </w:rPr>
+      </w:pPr>
+      <w:bookmarkStart w:id="0" w:name="_Toc240022953"/>
+      <w:bookmarkStart w:id="1" w:name="_Toc240287879"/>
+      <w:r>
+        <w:rPr>
+          <w:rFonts w:cs="Arial"/>
+        </w:rPr>
+        <w:lastRenderedPageBreak/>
+        <w:t>1) Fragen in der Angabe</w:t>
+      </w:r>
+      <w:bookmarkEnd w:id="0"/>
+      <w:bookmarkEnd w:id="1"/>
+    </w:p>
+    <w:p>
+      <w:pPr>
+        <w:rPr>
+          <w:rFonts w:ascii="Arial" w:hAnsi="Arial" w:cs="Arial"/>
+          <w:sz w:val="2"/>
+          <w:szCs w:val="2"/>
+        </w:rPr>
+      </w:pPr>
+      <w:bookmarkStart w:id="2" w:name="_Toc240022954"/>
+    </w:p>
+    <w:p>
+      <w:pPr>
         <w:pStyle w:val="berschrift10"/>
+        <w:jc w:val="both"/>
         <w:rPr>
           <w:rFonts w:cs="Arial"/>
         </w:rPr>
       </w:pPr>
-      <w:bookmarkStart w:id="0" w:name="_Toc240022157"/>
+      <w:bookmarkStart w:id="3" w:name="_Toc240287880"/>
       <w:r>
         <w:rPr>
           <w:rFonts w:cs="Arial"/>
         </w:rPr>
-        <w:lastRenderedPageBreak/>
         <w:t>Welche Vorteile kann eine Handygarage im familiären Umfeld haben?</w:t>
       </w:r>
-      <w:bookmarkEnd w:id="0"/>
+      <w:bookmarkEnd w:id="2"/>
+      <w:bookmarkEnd w:id="3"/>
     </w:p>
     <w:p>
       <w:pPr>
@@ -573,6 +2109,7 @@
           <w:ilvl w:val="0"/>
           <w:numId w:val="4"/>
         </w:numPr>
+        <w:jc w:val="both"/>
         <w:rPr>
           <w:rFonts w:ascii="Arial" w:hAnsi="Arial" w:cs="Arial"/>
         </w:rPr>
@@ -611,6 +2148,7 @@
           <w:ilvl w:val="0"/>
           <w:numId w:val="4"/>
         </w:numPr>
+        <w:jc w:val="both"/>
         <w:rPr>
           <w:rFonts w:ascii="Arial" w:hAnsi="Arial" w:cs="Arial"/>
         </w:rPr>
@@ -627,37 +2165,7 @@
         <w:rPr>
           <w:rFonts w:ascii="Arial" w:hAnsi="Arial" w:cs="Arial"/>
         </w:rPr>
-        <w:t xml:space="preserve"> </w:t>
-      </w:r>
-      <w:r>
-        <w:rPr>
-          <w:rFonts w:ascii="Arial" w:hAnsi="Arial" w:cs="Arial"/>
-        </w:rPr>
-        <w:t>Wenn die Regel</w:t>
-      </w:r>
-      <w:r>
-        <w:rPr>
-          <w:rFonts w:ascii="Arial" w:hAnsi="Arial" w:cs="Arial"/>
-        </w:rPr>
-        <w:t>n über Handy</w:t>
-      </w:r>
-      <w:r>
-        <w:rPr>
-          <w:rFonts w:ascii="Arial" w:hAnsi="Arial" w:cs="Arial"/>
-        </w:rPr>
-        <w:t xml:space="preserve"> für alle Familienmitglieder </w:t>
-      </w:r>
-      <w:r>
-        <w:rPr>
-          <w:rFonts w:ascii="Arial" w:hAnsi="Arial" w:cs="Arial"/>
-        </w:rPr>
-        <w:t>gelten</w:t>
-      </w:r>
-      <w:r>
-        <w:rPr>
-          <w:rFonts w:ascii="Arial" w:hAnsi="Arial" w:cs="Arial"/>
-        </w:rPr>
-        <w:t>, fühlen sich Kinder und Jugendliche weniger kontrolliert.</w:t>
+        <w:t xml:space="preserve"> Wenn die Regeln über Handy für alle Familienmitglieder gelten, fühlen sich Kinder und Jugendliche weniger kontrolliert.</w:t>
       </w:r>
     </w:p>
     <w:p>
@@ -667,6 +2175,7 @@
           <w:ilvl w:val="0"/>
           <w:numId w:val="4"/>
         </w:numPr>
+        <w:jc w:val="both"/>
         <w:rPr>
           <w:rFonts w:ascii="Arial" w:hAnsi="Arial" w:cs="Arial"/>
         </w:rPr>
@@ -693,6 +2202,7 @@
           <w:ilvl w:val="0"/>
           <w:numId w:val="4"/>
         </w:numPr>
+        <w:jc w:val="both"/>
         <w:rPr>
           <w:rFonts w:ascii="Arial" w:hAnsi="Arial" w:cs="Arial"/>
         </w:rPr>
@@ -733,6 +2243,7 @@
           <w:ilvl w:val="0"/>
           <w:numId w:val="4"/>
         </w:numPr>
+        <w:jc w:val="both"/>
         <w:rPr>
           <w:rFonts w:ascii="Arial" w:hAnsi="Arial" w:cs="Arial"/>
         </w:rPr>
@@ -759,6 +2270,7 @@
           <w:ilvl w:val="0"/>
           <w:numId w:val="4"/>
         </w:numPr>
+        <w:jc w:val="both"/>
         <w:rPr>
           <w:rFonts w:ascii="Arial" w:hAnsi="Arial" w:cs="Arial"/>
         </w:rPr>
@@ -769,15 +2281,7 @@
           <w:b/>
           <w:bCs/>
         </w:rPr>
-        <w:t>Mehr gemeinsame Zeit:</w:t>
-      </w:r>
-      <w:r>
-        <w:rPr>
-          <w:rFonts w:ascii="Arial" w:hAnsi="Arial" w:cs="Arial"/>
-          <w:b/>
-          <w:bCs/>
-        </w:rPr>
-        <w:t xml:space="preserve"> </w:t>
+        <w:t xml:space="preserve">Mehr gemeinsame Zeit: </w:t>
       </w:r>
       <w:r>
         <w:rPr>
@@ -793,6 +2297,7 @@
           <w:ilvl w:val="0"/>
           <w:numId w:val="4"/>
         </w:numPr>
+        <w:jc w:val="both"/>
         <w:rPr>
           <w:rFonts w:ascii="Arial" w:hAnsi="Arial" w:cs="Arial"/>
         </w:rPr>
@@ -814,26 +2319,22 @@
     </w:p>
     <w:p>
       <w:pPr>
-        <w:rPr>
-          <w:rFonts w:ascii="Arial" w:hAnsi="Arial" w:cs="Arial"/>
-        </w:rPr>
-      </w:pPr>
-    </w:p>
-    <w:p>
-      <w:pPr>
         <w:pStyle w:val="berschrift10"/>
+        <w:jc w:val="both"/>
         <w:rPr>
           <w:rFonts w:cs="Arial"/>
         </w:rPr>
       </w:pPr>
-      <w:bookmarkStart w:id="1" w:name="_Toc240022158"/>
+      <w:bookmarkStart w:id="4" w:name="_Toc240022955"/>
+      <w:bookmarkStart w:id="5" w:name="_Toc240287881"/>
       <w:r>
         <w:rPr>
           <w:rFonts w:cs="Arial"/>
         </w:rPr>
         <w:t>Welche Situationen eignen sich besonders für eine Smartphone-Ablage?</w:t>
       </w:r>
-      <w:bookmarkEnd w:id="1"/>
+      <w:bookmarkEnd w:id="4"/>
+      <w:bookmarkEnd w:id="5"/>
     </w:p>
     <w:p>
       <w:pPr>
@@ -842,27 +2343,16 @@
           <w:ilvl w:val="0"/>
           <w:numId w:val="5"/>
         </w:numPr>
-        <w:rPr>
-          <w:rFonts w:ascii="Arial" w:hAnsi="Arial" w:cs="Arial"/>
-        </w:rPr>
-      </w:pPr>
-      <w:r>
-        <w:rPr>
-          <w:rFonts w:ascii="Arial" w:hAnsi="Arial" w:cs="Arial"/>
-        </w:rPr>
-        <w:t>Beim gemeinsamen Essen</w:t>
-      </w:r>
-      <w:r>
-        <w:rPr>
-          <w:rFonts w:ascii="Arial" w:hAnsi="Arial" w:cs="Arial"/>
-        </w:rPr>
-        <w:t>,</w:t>
-      </w:r>
-      <w:r>
-        <w:rPr>
-          <w:rFonts w:ascii="Arial" w:hAnsi="Arial" w:cs="Arial"/>
-        </w:rPr>
-        <w:t xml:space="preserve"> weniger Ablenkung und mehr Gespräche</w:t>
+        <w:jc w:val="both"/>
+        <w:rPr>
+          <w:rFonts w:ascii="Arial" w:hAnsi="Arial" w:cs="Arial"/>
+        </w:rPr>
+      </w:pPr>
+      <w:r>
+        <w:rPr>
+          <w:rFonts w:ascii="Arial" w:hAnsi="Arial" w:cs="Arial"/>
+        </w:rPr>
+        <w:t>Beim gemeinsamen Essen, weniger Ablenkung und mehr Gespräche</w:t>
       </w:r>
     </w:p>
     <w:p>
@@ -872,27 +2362,16 @@
           <w:ilvl w:val="0"/>
           <w:numId w:val="5"/>
         </w:numPr>
-        <w:rPr>
-          <w:rFonts w:ascii="Arial" w:hAnsi="Arial" w:cs="Arial"/>
-        </w:rPr>
-      </w:pPr>
-      <w:r>
-        <w:rPr>
-          <w:rFonts w:ascii="Arial" w:hAnsi="Arial" w:cs="Arial"/>
-        </w:rPr>
-        <w:t>Vor dem Schlafengehen</w:t>
-      </w:r>
-      <w:r>
-        <w:rPr>
-          <w:rFonts w:ascii="Arial" w:hAnsi="Arial" w:cs="Arial"/>
-        </w:rPr>
-        <w:t>,</w:t>
-      </w:r>
-      <w:r>
-        <w:rPr>
-          <w:rFonts w:ascii="Arial" w:hAnsi="Arial" w:cs="Arial"/>
-        </w:rPr>
-        <w:t xml:space="preserve"> Handy nicht direkt neben dem Bett</w:t>
+        <w:jc w:val="both"/>
+        <w:rPr>
+          <w:rFonts w:ascii="Arial" w:hAnsi="Arial" w:cs="Arial"/>
+        </w:rPr>
+      </w:pPr>
+      <w:r>
+        <w:rPr>
+          <w:rFonts w:ascii="Arial" w:hAnsi="Arial" w:cs="Arial"/>
+        </w:rPr>
+        <w:t>Vor dem Schlafengehen, Handy nicht direkt neben dem Bett</w:t>
       </w:r>
     </w:p>
     <w:p>
@@ -902,27 +2381,16 @@
           <w:ilvl w:val="0"/>
           <w:numId w:val="5"/>
         </w:numPr>
-        <w:rPr>
-          <w:rFonts w:ascii="Arial" w:hAnsi="Arial" w:cs="Arial"/>
-        </w:rPr>
-      </w:pPr>
-      <w:r>
-        <w:rPr>
-          <w:rFonts w:ascii="Arial" w:hAnsi="Arial" w:cs="Arial"/>
-        </w:rPr>
-        <w:t>Bei Familienfeiern</w:t>
-      </w:r>
-      <w:r>
-        <w:rPr>
-          <w:rFonts w:ascii="Arial" w:hAnsi="Arial" w:cs="Arial"/>
-        </w:rPr>
-        <w:t>,</w:t>
-      </w:r>
-      <w:r>
-        <w:rPr>
-          <w:rFonts w:ascii="Arial" w:hAnsi="Arial" w:cs="Arial"/>
-        </w:rPr>
-        <w:t xml:space="preserve"> mehr persönliche Interaktion</w:t>
+        <w:jc w:val="both"/>
+        <w:rPr>
+          <w:rFonts w:ascii="Arial" w:hAnsi="Arial" w:cs="Arial"/>
+        </w:rPr>
+      </w:pPr>
+      <w:r>
+        <w:rPr>
+          <w:rFonts w:ascii="Arial" w:hAnsi="Arial" w:cs="Arial"/>
+        </w:rPr>
+        <w:t>Bei Familienfeiern, mehr persönliche Interaktion</w:t>
       </w:r>
     </w:p>
     <w:p>
@@ -932,27 +2400,16 @@
           <w:ilvl w:val="0"/>
           <w:numId w:val="5"/>
         </w:numPr>
-        <w:rPr>
-          <w:rFonts w:ascii="Arial" w:hAnsi="Arial" w:cs="Arial"/>
-        </w:rPr>
-      </w:pPr>
-      <w:r>
-        <w:rPr>
-          <w:rFonts w:ascii="Arial" w:hAnsi="Arial" w:cs="Arial"/>
-        </w:rPr>
-        <w:t>Beim Lernen oder Hausaufgaben machen</w:t>
-      </w:r>
-      <w:r>
-        <w:rPr>
-          <w:rFonts w:ascii="Arial" w:hAnsi="Arial" w:cs="Arial"/>
-        </w:rPr>
-        <w:t>,</w:t>
-      </w:r>
-      <w:r>
-        <w:rPr>
-          <w:rFonts w:ascii="Arial" w:hAnsi="Arial" w:cs="Arial"/>
-        </w:rPr>
-        <w:t xml:space="preserve"> bessere Konzentration</w:t>
+        <w:jc w:val="both"/>
+        <w:rPr>
+          <w:rFonts w:ascii="Arial" w:hAnsi="Arial" w:cs="Arial"/>
+        </w:rPr>
+      </w:pPr>
+      <w:r>
+        <w:rPr>
+          <w:rFonts w:ascii="Arial" w:hAnsi="Arial" w:cs="Arial"/>
+        </w:rPr>
+        <w:t>Beim Lernen oder Hausaufgaben machen, bessere Konzentration</w:t>
       </w:r>
     </w:p>
     <w:p>
@@ -962,51 +2419,36 @@
           <w:ilvl w:val="0"/>
           <w:numId w:val="5"/>
         </w:numPr>
-        <w:rPr>
-          <w:rFonts w:ascii="Arial" w:hAnsi="Arial" w:cs="Arial"/>
-        </w:rPr>
-      </w:pPr>
-      <w:r>
-        <w:rPr>
-          <w:rFonts w:ascii="Arial" w:hAnsi="Arial" w:cs="Arial"/>
-        </w:rPr>
-        <w:t>Bei Besprechungen oder Meetings</w:t>
-      </w:r>
-      <w:r>
-        <w:rPr>
-          <w:rFonts w:ascii="Arial" w:hAnsi="Arial" w:cs="Arial"/>
-        </w:rPr>
-        <w:t>,</w:t>
-      </w:r>
-      <w:r>
-        <w:rPr>
-          <w:rFonts w:ascii="Arial" w:hAnsi="Arial" w:cs="Arial"/>
-        </w:rPr>
-        <w:t xml:space="preserve"> weniger Unterbrechungen</w:t>
-      </w:r>
-    </w:p>
-    <w:p>
-      <w:pPr>
-        <w:rPr>
-          <w:rFonts w:ascii="Arial" w:hAnsi="Arial" w:cs="Arial"/>
-        </w:rPr>
-      </w:pPr>
+        <w:jc w:val="both"/>
+        <w:rPr>
+          <w:rFonts w:ascii="Arial" w:hAnsi="Arial" w:cs="Arial"/>
+        </w:rPr>
+      </w:pPr>
+      <w:r>
+        <w:rPr>
+          <w:rFonts w:ascii="Arial" w:hAnsi="Arial" w:cs="Arial"/>
+        </w:rPr>
+        <w:t>Bei Besprechungen oder Meetings, weniger Unterbrechungen</w:t>
+      </w:r>
     </w:p>
     <w:p>
       <w:pPr>
         <w:pStyle w:val="berschrift10"/>
+        <w:jc w:val="both"/>
         <w:rPr>
           <w:rFonts w:cs="Arial"/>
         </w:rPr>
       </w:pPr>
-      <w:bookmarkStart w:id="2" w:name="_Toc240022159"/>
+      <w:bookmarkStart w:id="6" w:name="_Toc240022956"/>
+      <w:bookmarkStart w:id="7" w:name="_Toc240287882"/>
       <w:r>
         <w:rPr>
           <w:rFonts w:cs="Arial"/>
         </w:rPr>
         <w:t>Welche möglichen Probleme oder Nachteile könnten entstehen?</w:t>
       </w:r>
-      <w:bookmarkEnd w:id="2"/>
+      <w:bookmarkEnd w:id="6"/>
+      <w:bookmarkEnd w:id="7"/>
     </w:p>
     <w:p>
       <w:pPr>
@@ -1015,6 +2457,7 @@
           <w:ilvl w:val="0"/>
           <w:numId w:val="7"/>
         </w:numPr>
+        <w:jc w:val="both"/>
         <w:rPr>
           <w:rFonts w:ascii="Arial" w:hAnsi="Arial" w:cs="Arial"/>
         </w:rPr>
@@ -1033,6 +2476,7 @@
           <w:ilvl w:val="0"/>
           <w:numId w:val="7"/>
         </w:numPr>
+        <w:jc w:val="both"/>
         <w:rPr>
           <w:rFonts w:ascii="Arial" w:hAnsi="Arial" w:cs="Arial"/>
         </w:rPr>
@@ -1051,6 +2495,7 @@
           <w:ilvl w:val="0"/>
           <w:numId w:val="7"/>
         </w:numPr>
+        <w:jc w:val="both"/>
         <w:rPr>
           <w:rFonts w:ascii="Arial" w:hAnsi="Arial" w:cs="Arial"/>
         </w:rPr>
@@ -1069,6 +2514,7 @@
           <w:ilvl w:val="0"/>
           <w:numId w:val="7"/>
         </w:numPr>
+        <w:jc w:val="both"/>
         <w:rPr>
           <w:rFonts w:ascii="Arial" w:hAnsi="Arial" w:cs="Arial"/>
         </w:rPr>
@@ -1082,26 +2528,22 @@
     </w:p>
     <w:p>
       <w:pPr>
-        <w:rPr>
-          <w:rFonts w:ascii="Arial" w:hAnsi="Arial" w:cs="Arial"/>
-        </w:rPr>
-      </w:pPr>
-    </w:p>
-    <w:p>
-      <w:pPr>
         <w:pStyle w:val="berschrift10"/>
+        <w:jc w:val="both"/>
         <w:rPr>
           <w:rFonts w:cs="Arial"/>
         </w:rPr>
       </w:pPr>
-      <w:bookmarkStart w:id="3" w:name="_Toc240022160"/>
+      <w:bookmarkStart w:id="8" w:name="_Toc240022957"/>
+      <w:bookmarkStart w:id="9" w:name="_Toc240287883"/>
       <w:r>
         <w:rPr>
           <w:rFonts w:cs="Arial"/>
         </w:rPr>
         <w:t>Welche Geräte/ Ablagesysteme gibt es bereits?</w:t>
       </w:r>
-      <w:bookmarkEnd w:id="3"/>
+      <w:bookmarkEnd w:id="8"/>
+      <w:bookmarkEnd w:id="9"/>
     </w:p>
     <w:p>
       <w:pPr>
@@ -1110,6 +2552,7 @@
           <w:ilvl w:val="0"/>
           <w:numId w:val="8"/>
         </w:numPr>
+        <w:jc w:val="both"/>
         <w:rPr>
           <w:rFonts w:ascii="Arial" w:hAnsi="Arial" w:cs="Arial"/>
         </w:rPr>
@@ -1140,19 +2583,7 @@
         <w:rPr>
           <w:rFonts w:ascii="Arial" w:hAnsi="Arial" w:cs="Arial"/>
         </w:rPr>
-        <w:t>“</w:t>
-      </w:r>
-      <w:r>
-        <w:rPr>
-          <w:rFonts w:ascii="Arial" w:hAnsi="Arial" w:cs="Arial"/>
-        </w:rPr>
-        <w:t xml:space="preserve">, </w:t>
-      </w:r>
-      <w:r>
-        <w:rPr>
-          <w:rFonts w:ascii="Arial" w:hAnsi="Arial" w:cs="Arial"/>
-        </w:rPr>
-        <w:t>Hängeablage mit Taschen</w:t>
+        <w:t>“, Hängeablage mit Taschen</w:t>
       </w:r>
     </w:p>
     <w:p>
@@ -1162,6 +2593,7 @@
           <w:ilvl w:val="0"/>
           <w:numId w:val="8"/>
         </w:numPr>
+        <w:jc w:val="both"/>
         <w:rPr>
           <w:rFonts w:ascii="Arial" w:hAnsi="Arial" w:cs="Arial"/>
         </w:rPr>
@@ -1178,19 +2610,7 @@
         <w:rPr>
           <w:rFonts w:ascii="Arial" w:hAnsi="Arial" w:cs="Arial"/>
         </w:rPr>
-        <w:t xml:space="preserve"> Handyhotel</w:t>
-      </w:r>
-      <w:r>
-        <w:rPr>
-          <w:rFonts w:ascii="Arial" w:hAnsi="Arial" w:cs="Arial"/>
-        </w:rPr>
-        <w:t xml:space="preserve">, </w:t>
-      </w:r>
-      <w:r>
-        <w:rPr>
-          <w:rFonts w:ascii="Arial" w:hAnsi="Arial" w:cs="Arial"/>
-        </w:rPr>
-        <w:t>Hängeablage mit nummerierten Fächern</w:t>
+        <w:t xml:space="preserve"> Handyhotel, Hängeablage mit nummerierten Fächern</w:t>
       </w:r>
     </w:p>
     <w:p>
@@ -1200,27 +2620,16 @@
           <w:ilvl w:val="0"/>
           <w:numId w:val="8"/>
         </w:numPr>
-        <w:rPr>
-          <w:rFonts w:ascii="Arial" w:hAnsi="Arial" w:cs="Arial"/>
-        </w:rPr>
-      </w:pPr>
-      <w:r>
-        <w:rPr>
-          <w:rFonts w:ascii="Arial" w:hAnsi="Arial" w:cs="Arial"/>
-        </w:rPr>
-        <w:t>SPINDMAX HG-2-24-ZS</w:t>
-      </w:r>
-      <w:r>
-        <w:rPr>
-          <w:rFonts w:ascii="Arial" w:hAnsi="Arial" w:cs="Arial"/>
-        </w:rPr>
-        <w:t xml:space="preserve">, </w:t>
-      </w:r>
-      <w:r>
-        <w:rPr>
-          <w:rFonts w:ascii="Arial" w:hAnsi="Arial" w:cs="Arial"/>
-        </w:rPr>
-        <w:t>Abschließbare Handygarage</w:t>
+        <w:jc w:val="both"/>
+        <w:rPr>
+          <w:rFonts w:ascii="Arial" w:hAnsi="Arial" w:cs="Arial"/>
+        </w:rPr>
+      </w:pPr>
+      <w:r>
+        <w:rPr>
+          <w:rFonts w:ascii="Arial" w:hAnsi="Arial" w:cs="Arial"/>
+        </w:rPr>
+        <w:t>SPINDMAX HG-2-24-ZS, Abschließbare Handygarage</w:t>
       </w:r>
       <w:r>
         <w:rPr>
@@ -1236,27 +2645,16 @@
           <w:ilvl w:val="0"/>
           <w:numId w:val="8"/>
         </w:numPr>
-        <w:rPr>
-          <w:rFonts w:ascii="Arial" w:hAnsi="Arial" w:cs="Arial"/>
-        </w:rPr>
-      </w:pPr>
-      <w:r>
-        <w:rPr>
-          <w:rFonts w:ascii="Arial" w:hAnsi="Arial" w:cs="Arial"/>
-        </w:rPr>
-        <w:t>Bravour Drop &amp; Safe 36</w:t>
-      </w:r>
-      <w:r>
-        <w:rPr>
-          <w:rFonts w:ascii="Arial" w:hAnsi="Arial" w:cs="Arial"/>
-        </w:rPr>
-        <w:t xml:space="preserve">, </w:t>
-      </w:r>
-      <w:r>
-        <w:rPr>
-          <w:rFonts w:ascii="Arial" w:hAnsi="Arial" w:cs="Arial"/>
-        </w:rPr>
-        <w:t xml:space="preserve">Metallschrank mit </w:t>
+        <w:jc w:val="both"/>
+        <w:rPr>
+          <w:rFonts w:ascii="Arial" w:hAnsi="Arial" w:cs="Arial"/>
+        </w:rPr>
+      </w:pPr>
+      <w:r>
+        <w:rPr>
+          <w:rFonts w:ascii="Arial" w:hAnsi="Arial" w:cs="Arial"/>
+        </w:rPr>
+        <w:t xml:space="preserve">Bravour Drop &amp; Safe 36, Metallschrank mit </w:t>
       </w:r>
       <w:proofErr w:type="spellStart"/>
       <w:r>
@@ -1270,11 +2668,13 @@
     <w:p>
       <w:pPr>
         <w:pStyle w:val="berschrift10"/>
+        <w:jc w:val="both"/>
         <w:rPr>
           <w:rFonts w:cs="Arial"/>
         </w:rPr>
       </w:pPr>
-      <w:bookmarkStart w:id="4" w:name="_Toc240022161"/>
+      <w:bookmarkStart w:id="10" w:name="_Toc240022958"/>
+      <w:bookmarkStart w:id="11" w:name="_Toc240287884"/>
       <w:r>
         <w:rPr>
           <w:rFonts w:cs="Arial"/>
@@ -1282,7 +2682,8 @@
         <w:lastRenderedPageBreak/>
         <w:t>Welche technischen Möglichkeiten (Werkzeuge, Material, etc.) können für das Konzept herangezogen werden?</w:t>
       </w:r>
-      <w:bookmarkEnd w:id="4"/>
+      <w:bookmarkEnd w:id="10"/>
+      <w:bookmarkEnd w:id="11"/>
     </w:p>
     <w:p>
       <w:pPr>
@@ -1291,6 +2692,7 @@
           <w:ilvl w:val="0"/>
           <w:numId w:val="9"/>
         </w:numPr>
+        <w:jc w:val="both"/>
         <w:rPr>
           <w:rFonts w:ascii="Arial" w:hAnsi="Arial" w:cs="Arial"/>
         </w:rPr>
@@ -1307,13 +2709,7 @@
         <w:rPr>
           <w:rFonts w:ascii="Arial" w:hAnsi="Arial" w:cs="Arial"/>
         </w:rPr>
-        <w:t xml:space="preserve">, </w:t>
-      </w:r>
-      <w:r>
-        <w:rPr>
-          <w:rFonts w:ascii="Arial" w:hAnsi="Arial" w:cs="Arial"/>
-        </w:rPr>
-        <w:t>Gehäuse, Handyfächer, Halterungen und Führungselemente</w:t>
+        <w:t>, Gehäuse, Handyfächer, Halterungen und Führungselemente</w:t>
       </w:r>
     </w:p>
     <w:p>
@@ -1323,6 +2719,7 @@
           <w:ilvl w:val="0"/>
           <w:numId w:val="9"/>
         </w:numPr>
+        <w:jc w:val="both"/>
         <w:rPr>
           <w:rFonts w:ascii="Arial" w:hAnsi="Arial" w:cs="Arial"/>
         </w:rPr>
@@ -1339,13 +2736,7 @@
         <w:rPr>
           <w:rFonts w:ascii="Arial" w:hAnsi="Arial" w:cs="Arial"/>
         </w:rPr>
-        <w:t xml:space="preserve">, </w:t>
-      </w:r>
-      <w:r>
-        <w:rPr>
-          <w:rFonts w:ascii="Arial" w:hAnsi="Arial" w:cs="Arial"/>
-        </w:rPr>
-        <w:t>Gehäuse und Trennwände aus Holz oder Acrylglas</w:t>
+        <w:t>, Gehäuse und Trennwände aus Holz oder Acrylglas</w:t>
       </w:r>
     </w:p>
     <w:p>
@@ -1355,6 +2746,7 @@
           <w:ilvl w:val="0"/>
           <w:numId w:val="9"/>
         </w:numPr>
+        <w:jc w:val="both"/>
         <w:rPr>
           <w:rFonts w:ascii="Arial" w:hAnsi="Arial" w:cs="Arial"/>
         </w:rPr>
@@ -1371,13 +2763,7 @@
         <w:rPr>
           <w:rFonts w:ascii="Arial" w:hAnsi="Arial" w:cs="Arial"/>
         </w:rPr>
-        <w:t>,</w:t>
-      </w:r>
-      <w:r>
-        <w:rPr>
-          <w:rFonts w:ascii="Arial" w:hAnsi="Arial" w:cs="Arial"/>
-        </w:rPr>
-        <w:t xml:space="preserve"> für die Grundkonstruktion</w:t>
+        <w:t>, für die Grundkonstruktion</w:t>
       </w:r>
     </w:p>
     <w:p>
@@ -1387,6 +2773,7 @@
           <w:ilvl w:val="0"/>
           <w:numId w:val="9"/>
         </w:numPr>
+        <w:jc w:val="both"/>
         <w:rPr>
           <w:rFonts w:ascii="Arial" w:hAnsi="Arial" w:cs="Arial"/>
         </w:rPr>
@@ -1403,13 +2790,7 @@
         <w:rPr>
           <w:rFonts w:ascii="Arial" w:hAnsi="Arial" w:cs="Arial"/>
         </w:rPr>
-        <w:t xml:space="preserve">, </w:t>
-      </w:r>
-      <w:r>
-        <w:rPr>
-          <w:rFonts w:ascii="Arial" w:hAnsi="Arial" w:cs="Arial"/>
-        </w:rPr>
-        <w:t>Anzeige, ob ein Fach belegt oder gesperrt ist</w:t>
+        <w:t>, Anzeige, ob ein Fach belegt oder gesperrt ist</w:t>
       </w:r>
     </w:p>
     <w:p>
@@ -1419,6 +2800,7 @@
           <w:ilvl w:val="0"/>
           <w:numId w:val="9"/>
         </w:numPr>
+        <w:jc w:val="both"/>
         <w:rPr>
           <w:rFonts w:ascii="Arial" w:hAnsi="Arial" w:cs="Arial"/>
         </w:rPr>
@@ -1429,15 +2811,7 @@
           <w:b/>
           <w:bCs/>
         </w:rPr>
-        <w:t>ESP32</w:t>
-      </w:r>
-      <w:r>
-        <w:rPr>
-          <w:rFonts w:ascii="Arial" w:hAnsi="Arial" w:cs="Arial"/>
-          <w:b/>
-          <w:bCs/>
-        </w:rPr>
-        <w:t>,</w:t>
+        <w:t>ESP32,</w:t>
       </w:r>
       <w:r>
         <w:rPr>
@@ -1453,6 +2827,7 @@
           <w:ilvl w:val="0"/>
           <w:numId w:val="9"/>
         </w:numPr>
+        <w:jc w:val="both"/>
         <w:rPr>
           <w:rFonts w:ascii="Arial" w:hAnsi="Arial" w:cs="Arial"/>
         </w:rPr>
@@ -1479,6 +2854,7 @@
           <w:ilvl w:val="0"/>
           <w:numId w:val="9"/>
         </w:numPr>
+        <w:jc w:val="both"/>
         <w:rPr>
           <w:rFonts w:ascii="Arial" w:hAnsi="Arial" w:cs="Arial"/>
         </w:rPr>
@@ -1505,6 +2881,7 @@
           <w:ilvl w:val="0"/>
           <w:numId w:val="9"/>
         </w:numPr>
+        <w:jc w:val="both"/>
         <w:rPr>
           <w:rFonts w:ascii="Arial" w:hAnsi="Arial" w:cs="Arial"/>
         </w:rPr>
@@ -1531,6 +2908,7 @@
           <w:ilvl w:val="0"/>
           <w:numId w:val="9"/>
         </w:numPr>
+        <w:jc w:val="both"/>
         <w:rPr>
           <w:rFonts w:ascii="Arial" w:hAnsi="Arial" w:cs="Arial"/>
         </w:rPr>
@@ -1552,7 +2930,834 @@
     </w:p>
     <w:p>
       <w:pPr>
-        <w:ind w:left="360"/>
+        <w:ind w:left="708"/>
+        <w:rPr>
+          <w:rFonts w:ascii="Arial" w:hAnsi="Arial" w:cs="Arial"/>
+        </w:rPr>
+      </w:pPr>
+      <w:r>
+        <w:rPr>
+          <w:rFonts w:ascii="Arial" w:hAnsi="Arial" w:cs="Arial"/>
+        </w:rPr>
+        <w:br w:type="page"/>
+      </w:r>
+    </w:p>
+    <w:p>
+      <w:pPr>
+        <w:pStyle w:val="berschrift"/>
+        <w:jc w:val="center"/>
+        <w:rPr>
+          <w:rFonts w:cs="Arial"/>
+        </w:rPr>
+      </w:pPr>
+      <w:bookmarkStart w:id="12" w:name="_Toc240287885"/>
+      <w:r>
+        <w:rPr>
+          <w:rFonts w:cs="Arial"/>
+        </w:rPr>
+        <w:lastRenderedPageBreak/>
+        <w:t>2)</w:t>
+      </w:r>
+      <w:r>
+        <w:rPr>
+          <w:rFonts w:cs="Arial"/>
+        </w:rPr>
+        <w:t>Rahmenbedingungen</w:t>
+      </w:r>
+      <w:bookmarkEnd w:id="12"/>
+    </w:p>
+    <w:p>
+      <w:pPr>
+        <w:pStyle w:val="berschrift10"/>
+        <w:rPr>
+          <w:rFonts w:cs="Arial"/>
+        </w:rPr>
+      </w:pPr>
+      <w:bookmarkStart w:id="13" w:name="_Toc240287886"/>
+      <w:r>
+        <w:rPr>
+          <w:rFonts w:cs="Arial"/>
+        </w:rPr>
+        <w:t>Technische Anforderungen</w:t>
+      </w:r>
+      <w:bookmarkEnd w:id="13"/>
+    </w:p>
+    <w:p>
+      <w:pPr>
+        <w:pStyle w:val="berschrift10"/>
+        <w:rPr>
+          <w:rFonts w:cs="Arial"/>
+        </w:rPr>
+      </w:pPr>
+      <w:bookmarkStart w:id="14" w:name="_Toc240287887"/>
+      <w:r>
+        <w:rPr>
+          <w:rFonts w:cs="Arial"/>
+        </w:rPr>
+        <w:t>Wissensbegrenzungen</w:t>
+      </w:r>
+      <w:bookmarkEnd w:id="14"/>
+    </w:p>
+    <w:p>
+      <w:pPr>
+        <w:pStyle w:val="berschrift10"/>
+        <w:rPr>
+          <w:rFonts w:cs="Arial"/>
+        </w:rPr>
+      </w:pPr>
+      <w:bookmarkStart w:id="15" w:name="_Toc240287888"/>
+      <w:r>
+        <w:rPr>
+          <w:rFonts w:cs="Arial"/>
+        </w:rPr>
+        <w:t>Kosten</w:t>
+      </w:r>
+      <w:bookmarkEnd w:id="15"/>
+    </w:p>
+    <w:p>
+      <w:pPr>
+        <w:pStyle w:val="berschrift10"/>
+        <w:rPr>
+          <w:rFonts w:cs="Arial"/>
+        </w:rPr>
+      </w:pPr>
+      <w:bookmarkStart w:id="16" w:name="_Toc240287889"/>
+      <w:r>
+        <w:rPr>
+          <w:rFonts w:cs="Arial"/>
+        </w:rPr>
+        <w:t>Hardwaregrenzen</w:t>
+      </w:r>
+      <w:bookmarkEnd w:id="16"/>
+    </w:p>
+    <w:p>
+      <w:pPr>
+        <w:pStyle w:val="berschrift10"/>
+        <w:rPr>
+          <w:rFonts w:cs="Arial"/>
+        </w:rPr>
+      </w:pPr>
+      <w:bookmarkStart w:id="17" w:name="_Toc240287890"/>
+      <w:r>
+        <w:rPr>
+          <w:rFonts w:cs="Arial"/>
+        </w:rPr>
+        <w:t>Softwaregrenzen</w:t>
+      </w:r>
+      <w:bookmarkEnd w:id="17"/>
+    </w:p>
+    <w:p>
+      <w:pPr>
+        <w:pStyle w:val="berschrift10"/>
+        <w:rPr>
+          <w:rFonts w:cs="Arial"/>
+        </w:rPr>
+      </w:pPr>
+      <w:r>
+        <w:rPr>
+          <w:rFonts w:cs="Arial"/>
+        </w:rPr>
+        <w:t>Eigener Plan</w:t>
+      </w:r>
+    </w:p>
+    <w:p>
+      <w:pPr>
+        <w:pStyle w:val="Listenabsatz"/>
+        <w:numPr>
+          <w:ilvl w:val="0"/>
+          <w:numId w:val="15"/>
+        </w:numPr>
+      </w:pPr>
+      <w:r>
+        <w:t>Der Plan ist das ein großer teil der Verwaltung über eine Webseite stattfindet. In dieser werden Handys zugeordnet, User erstellt, Daten angeschaut, Steckplätze überwacht.</w:t>
+      </w:r>
+    </w:p>
+    <w:p>
+      <w:pPr>
+        <w:pStyle w:val="Listenabsatz"/>
+        <w:numPr>
+          <w:ilvl w:val="0"/>
+          <w:numId w:val="15"/>
+        </w:numPr>
+      </w:pPr>
+      <w:r>
+        <w:t xml:space="preserve">Das Display ist, um einen QR-Code auf die Webseite zu liefern und vielleicht minimale Verwaltungen zu tätigen. Dieses soll aber versteckt sein und die </w:t>
+      </w:r>
+      <w:r>
+        <w:t>Benutzung</w:t>
+      </w:r>
+      <w:r>
+        <w:t xml:space="preserve"> nicht stören</w:t>
+      </w:r>
+    </w:p>
+    <w:p>
+      <w:pPr>
+        <w:pStyle w:val="Listenabsatz"/>
+        <w:numPr>
+          <w:ilvl w:val="0"/>
+          <w:numId w:val="15"/>
+        </w:numPr>
+      </w:pPr>
+      <w:r>
+        <w:t xml:space="preserve">Es soll automatisch erkannt </w:t>
+      </w:r>
+      <w:r>
+        <w:t>werden,</w:t>
+      </w:r>
+      <w:r>
+        <w:t xml:space="preserve"> wenn ein Handy angesteckt werden und Strom </w:t>
+      </w:r>
+      <w:r>
+        <w:t>gezogen wird.</w:t>
+      </w:r>
+    </w:p>
+    <w:p>
+      <w:pPr>
+        <w:pStyle w:val="Listenabsatz"/>
+        <w:numPr>
+          <w:ilvl w:val="0"/>
+          <w:numId w:val="15"/>
+        </w:numPr>
+      </w:pPr>
+      <w:r>
+        <w:t xml:space="preserve">Der Plan ist das ich die Stromversorgung und </w:t>
+      </w:r>
+      <w:r>
+        <w:t xml:space="preserve">das Display in ein eigenes Modul baue. </w:t>
+      </w:r>
+    </w:p>
+    <w:p>
+      <w:pPr>
+        <w:pStyle w:val="Listenabsatz"/>
+        <w:numPr>
+          <w:ilvl w:val="0"/>
+          <w:numId w:val="15"/>
+        </w:numPr>
+      </w:pPr>
+      <w:r>
+        <w:t>Es sollen frei Kabel angesteckt werden, die man möchte.</w:t>
+      </w:r>
+    </w:p>
+    <w:p>
+      <w:pPr>
+        <w:pStyle w:val="Listenabsatz"/>
+        <w:numPr>
+          <w:ilvl w:val="0"/>
+          <w:numId w:val="15"/>
+        </w:numPr>
+      </w:pPr>
+      <w:r>
+        <w:t xml:space="preserve">Das Netzteil und vielleicht die Lade Module sollten Temperaturüberwacht werden </w:t>
+      </w:r>
+    </w:p>
+    <w:p>
+      <w:pPr>
+        <w:pStyle w:val="Listenabsatz"/>
+        <w:numPr>
+          <w:ilvl w:val="0"/>
+          <w:numId w:val="15"/>
+        </w:numPr>
+      </w:pPr>
+      <w:r>
+        <w:t>Die Microcontroller von zwei Modulen sollten miteinander kommunizieren können am besten über Kabel und vielleicht sogar ihre Tasks Sharen.</w:t>
+      </w:r>
+    </w:p>
+    <w:p>
+      <w:pPr>
+        <w:pStyle w:val="berschrift1"/>
+        <w:rPr>
+          <w:rFonts w:ascii="Arial" w:hAnsi="Arial" w:cs="Arial"/>
+        </w:rPr>
+      </w:pPr>
+    </w:p>
+    <w:p>
+      <w:pPr>
+        <w:pStyle w:val="berschrift10"/>
+        <w:numPr>
+          <w:ilvl w:val="0"/>
+          <w:numId w:val="13"/>
+        </w:numPr>
+        <w:rPr>
+          <w:rFonts w:cs="Arial"/>
+        </w:rPr>
+      </w:pPr>
+      <w:r>
+        <w:rPr>
+          <w:rFonts w:cs="Arial"/>
+        </w:rPr>
+        <w:br w:type="page"/>
+      </w:r>
+    </w:p>
+    <w:p>
+      <w:pPr>
+        <w:pStyle w:val="berschrift"/>
+        <w:jc w:val="center"/>
+        <w:rPr>
+          <w:rFonts w:cs="Arial"/>
+        </w:rPr>
+      </w:pPr>
+      <w:bookmarkStart w:id="18" w:name="_Toc240287891"/>
+      <w:r>
+        <w:rPr>
+          <w:rFonts w:cs="Arial"/>
+        </w:rPr>
+        <w:lastRenderedPageBreak/>
+        <w:t>3</w:t>
+      </w:r>
+      <w:r>
+        <w:rPr>
+          <w:rFonts w:cs="Arial"/>
+        </w:rPr>
+        <w:t xml:space="preserve">) </w:t>
+      </w:r>
+      <w:r>
+        <w:rPr>
+          <w:rFonts w:cs="Arial"/>
+        </w:rPr>
+        <w:t>Hardware</w:t>
+      </w:r>
+      <w:bookmarkEnd w:id="18"/>
+    </w:p>
+    <w:p>
+      <w:pPr>
+        <w:pStyle w:val="berschrift10"/>
+        <w:rPr>
+          <w:rFonts w:cs="Arial"/>
+        </w:rPr>
+      </w:pPr>
+      <w:bookmarkStart w:id="19" w:name="_Toc240287892"/>
+      <w:r>
+        <w:rPr>
+          <w:rFonts w:cs="Arial"/>
+        </w:rPr>
+        <w:t>Teile die zu verbauen sind</w:t>
+      </w:r>
+      <w:bookmarkEnd w:id="19"/>
+    </w:p>
+    <w:p>
+      <w:pPr>
+        <w:pStyle w:val="berschrift20"/>
+        <w:numPr>
+          <w:ilvl w:val="0"/>
+          <w:numId w:val="11"/>
+        </w:numPr>
+        <w:rPr>
+          <w:rFonts w:cs="Arial"/>
+        </w:rPr>
+      </w:pPr>
+      <w:bookmarkStart w:id="20" w:name="_Toc240287893"/>
+      <w:r>
+        <w:rPr>
+          <w:rFonts w:cs="Arial"/>
+        </w:rPr>
+        <w:t>Registrieren des Handys:</w:t>
+      </w:r>
+      <w:bookmarkEnd w:id="20"/>
+    </w:p>
+    <w:p>
+      <w:pPr>
+        <w:pStyle w:val="Listenabsatz"/>
+        <w:numPr>
+          <w:ilvl w:val="1"/>
+          <w:numId w:val="11"/>
+        </w:numPr>
+        <w:rPr>
+          <w:rFonts w:ascii="Arial" w:hAnsi="Arial" w:cs="Arial"/>
+        </w:rPr>
+      </w:pPr>
+      <w:r>
+        <w:rPr>
+          <w:rFonts w:ascii="Arial" w:hAnsi="Arial" w:cs="Arial"/>
+        </w:rPr>
+        <w:t xml:space="preserve">Ich werde etwas brauchen das ich benutzen kann, wenn ein Handy angesteckt wird. Meine Idee ist zwischen einem Messer, ob Strom fließt oder Drucksensoren. Es könnte auch beides benutzt werden, sodass der User sein Handy nicht anstecken muss. Doch bei einem Drucksensor würde es komplizierter machen und werde ich mal anfangs weglassen. </w:t>
+      </w:r>
+      <w:r>
+        <w:rPr>
+          <w:rFonts w:ascii="Arial" w:hAnsi="Arial" w:cs="Arial"/>
+        </w:rPr>
+        <w:t xml:space="preserve"> </w:t>
+      </w:r>
+    </w:p>
+    <w:p>
+      <w:pPr>
+        <w:pStyle w:val="berschrift20"/>
+        <w:numPr>
+          <w:ilvl w:val="0"/>
+          <w:numId w:val="11"/>
+        </w:numPr>
+        <w:rPr>
+          <w:rFonts w:cs="Arial"/>
+        </w:rPr>
+      </w:pPr>
+      <w:r>
+        <w:rPr>
+          <w:rFonts w:cs="Arial"/>
+        </w:rPr>
+        <w:t>Mikrocontroller:</w:t>
+      </w:r>
+    </w:p>
+    <w:p>
+      <w:pPr>
+        <w:pStyle w:val="Listenabsatz"/>
+        <w:numPr>
+          <w:ilvl w:val="1"/>
+          <w:numId w:val="11"/>
+        </w:numPr>
+        <w:rPr>
+          <w:rFonts w:ascii="Arial" w:hAnsi="Arial" w:cs="Arial"/>
+        </w:rPr>
+      </w:pPr>
+      <w:r>
+        <w:rPr>
+          <w:rFonts w:ascii="Arial" w:hAnsi="Arial" w:cs="Arial"/>
+        </w:rPr>
+        <w:t xml:space="preserve">Ich brauche ein </w:t>
+      </w:r>
+      <w:r>
+        <w:rPr>
+          <w:rFonts w:ascii="Arial" w:hAnsi="Arial" w:cs="Arial"/>
+        </w:rPr>
+        <w:t>System,</w:t>
+      </w:r>
+      <w:r>
+        <w:rPr>
+          <w:rFonts w:ascii="Arial" w:hAnsi="Arial" w:cs="Arial"/>
+        </w:rPr>
+        <w:t xml:space="preserve"> das die Sensorik steuern kann. Vorzugweiße mit I</w:t>
+      </w:r>
+      <w:r>
+        <w:rPr>
+          <w:rFonts w:ascii="Arial" w:hAnsi="Arial" w:cs="Arial"/>
+          <w:vertAlign w:val="subscript"/>
+        </w:rPr>
+        <w:t>2</w:t>
+      </w:r>
+      <w:r>
+        <w:rPr>
+          <w:rFonts w:ascii="Arial" w:hAnsi="Arial" w:cs="Arial"/>
+        </w:rPr>
+        <w:t xml:space="preserve"> Möglichkeit damit</w:t>
+      </w:r>
+      <w:r>
+        <w:rPr>
+          <w:rFonts w:ascii="Arial" w:hAnsi="Arial" w:cs="Arial"/>
+        </w:rPr>
+        <w:t xml:space="preserve"> Sensorik leichter genutzt werden kann. Das Ziel ist außerdem das ein Großteil des Systems in einem Webbrowser läuft. Deswegen möchte ich auch eine WLAN-Funktion, Bluetooth Unterstützung ist nicht verpflichtend aber wäre vorteilhaft. Die Rechenleistung muss genug sein, um einen Webserver zu hosten. Außerdem muss es leicht zu entwickeln seine Bibliotheken für die meisten Sensoren haben und Pins haben. Der Preis</w:t>
+      </w:r>
+      <w:r>
+        <w:rPr>
+          <w:rFonts w:ascii="Arial" w:hAnsi="Arial" w:cs="Arial"/>
+        </w:rPr>
+        <w:t xml:space="preserve"> ist nur einmal zu zahlen heißt es kann auch ein wenig teuer sein.</w:t>
+      </w:r>
+    </w:p>
+    <w:p>
+      <w:pPr>
+        <w:pStyle w:val="berschrift20"/>
+        <w:numPr>
+          <w:ilvl w:val="0"/>
+          <w:numId w:val="11"/>
+        </w:numPr>
+        <w:rPr>
+          <w:rFonts w:cs="Arial"/>
+        </w:rPr>
+      </w:pPr>
+      <w:r>
+        <w:rPr>
+          <w:rFonts w:cs="Arial"/>
+        </w:rPr>
+        <w:t>Temperaturmesser:</w:t>
+      </w:r>
+    </w:p>
+    <w:p>
+      <w:pPr>
+        <w:pStyle w:val="Listenabsatz"/>
+        <w:numPr>
+          <w:ilvl w:val="1"/>
+          <w:numId w:val="11"/>
+        </w:numPr>
+        <w:rPr>
+          <w:rFonts w:ascii="Arial" w:hAnsi="Arial" w:cs="Arial"/>
+        </w:rPr>
+      </w:pPr>
+      <w:r>
+        <w:rPr>
+          <w:rFonts w:ascii="Arial" w:hAnsi="Arial" w:cs="Arial"/>
+        </w:rPr>
+        <w:t>Die Temperatur</w:t>
+      </w:r>
+      <w:r>
+        <w:rPr>
+          <w:rFonts w:ascii="Arial" w:hAnsi="Arial" w:cs="Arial"/>
+        </w:rPr>
+        <w:t>messung kann für zwei verschiedene Sachen benutzt werden die Stromversorgung muss auf jeden Fall gegen Temperatur überprüft werden. Der Mikrocontroller und die Handy Laden könnten auch gesichert werden. Eigentlich muss es nichts machen außer die Temperatur messen heißt es sollte billig sein.</w:t>
+      </w:r>
+    </w:p>
+    <w:p>
+      <w:pPr>
+        <w:pStyle w:val="berschrift20"/>
+        <w:numPr>
+          <w:ilvl w:val="0"/>
+          <w:numId w:val="11"/>
+        </w:numPr>
+        <w:rPr>
+          <w:rFonts w:cs="Arial"/>
+        </w:rPr>
+      </w:pPr>
+      <w:r>
+        <w:rPr>
+          <w:rFonts w:cs="Arial"/>
+        </w:rPr>
+        <w:t>Display</w:t>
+      </w:r>
+    </w:p>
+    <w:p>
+      <w:pPr>
+        <w:pStyle w:val="Listenabsatz"/>
+        <w:numPr>
+          <w:ilvl w:val="1"/>
+          <w:numId w:val="11"/>
+        </w:numPr>
+        <w:rPr>
+          <w:rFonts w:ascii="Arial" w:hAnsi="Arial" w:cs="Arial"/>
+        </w:rPr>
+      </w:pPr>
+      <w:r>
+        <w:rPr>
+          <w:rFonts w:ascii="Arial" w:hAnsi="Arial" w:cs="Arial"/>
+        </w:rPr>
+        <w:t>Das Display soll klein und billig sein</w:t>
+      </w:r>
+      <w:r>
+        <w:rPr>
+          <w:rFonts w:ascii="Arial" w:hAnsi="Arial" w:cs="Arial"/>
+        </w:rPr>
+        <w:t xml:space="preserve">. Es muss </w:t>
+      </w:r>
+      <w:r>
+        <w:rPr>
+          <w:rFonts w:ascii="Arial" w:hAnsi="Arial" w:cs="Arial"/>
+        </w:rPr>
+        <w:t>Text</w:t>
+      </w:r>
+      <w:r>
+        <w:rPr>
+          <w:rFonts w:ascii="Arial" w:hAnsi="Arial" w:cs="Arial"/>
+        </w:rPr>
+        <w:t xml:space="preserve"> displayen und </w:t>
+      </w:r>
+      <w:r>
+        <w:rPr>
+          <w:rFonts w:ascii="Arial" w:hAnsi="Arial" w:cs="Arial"/>
+        </w:rPr>
+        <w:t>leicht zum Schalten sein</w:t>
+      </w:r>
+    </w:p>
+    <w:p>
+      <w:pPr>
+        <w:pStyle w:val="berschrift20"/>
+        <w:numPr>
+          <w:ilvl w:val="0"/>
+          <w:numId w:val="11"/>
+        </w:numPr>
+        <w:rPr>
+          <w:rFonts w:cs="Arial"/>
+        </w:rPr>
+      </w:pPr>
+      <w:r>
+        <w:rPr>
+          <w:rFonts w:cs="Arial"/>
+        </w:rPr>
+        <w:t>Steuerung</w:t>
+      </w:r>
+    </w:p>
+    <w:p>
+      <w:pPr>
+        <w:pStyle w:val="Listenabsatz"/>
+        <w:numPr>
+          <w:ilvl w:val="1"/>
+          <w:numId w:val="11"/>
+        </w:numPr>
+        <w:rPr>
+          <w:rFonts w:ascii="Arial" w:hAnsi="Arial" w:cs="Arial"/>
+        </w:rPr>
+      </w:pPr>
+      <w:r>
+        <w:rPr>
+          <w:rFonts w:ascii="Arial" w:hAnsi="Arial" w:cs="Arial"/>
+        </w:rPr>
+        <w:t>Ich brauche nur eine simple Steuerung, mit der ich grundlegende Funktionen auf dem Display bedienen kann. Es muss nicht fortgeschritten seien ich brauche einen weiter Knopf einmal bestätigen und vielleicht zurück es sollte nicht zu auffällig sein und simpel zum Bedienen und coden sein.</w:t>
+      </w:r>
+    </w:p>
+    <w:p>
+      <w:pPr>
+        <w:pStyle w:val="berschrift20"/>
+        <w:numPr>
+          <w:ilvl w:val="0"/>
+          <w:numId w:val="11"/>
+        </w:numPr>
+        <w:rPr>
+          <w:rFonts w:cs="Arial"/>
+        </w:rPr>
+      </w:pPr>
+      <w:r>
+        <w:rPr>
+          <w:rFonts w:cs="Arial"/>
+        </w:rPr>
+        <w:lastRenderedPageBreak/>
+        <w:t>Stromversorgung</w:t>
+      </w:r>
+    </w:p>
+    <w:p>
+      <w:pPr>
+        <w:pStyle w:val="Listenabsatz"/>
+        <w:numPr>
+          <w:ilvl w:val="1"/>
+          <w:numId w:val="11"/>
+        </w:numPr>
+      </w:pPr>
+      <w:r>
+        <w:t>Die Stromversorgung muss auf jedenfalls 5V/8A liefern lieber ist 5V/10A. Es muss ein zertifiziertes Netzteil sein und vielleicht sogar extern, wenn dieses Leicht anzuschließen ist.</w:t>
+      </w:r>
+    </w:p>
+    <w:p>
+      <w:pPr>
+        <w:pStyle w:val="berschrift20"/>
+        <w:numPr>
+          <w:ilvl w:val="0"/>
+          <w:numId w:val="11"/>
+        </w:numPr>
+        <w:rPr>
+          <w:rFonts w:cs="Arial"/>
+        </w:rPr>
+      </w:pPr>
+      <w:r>
+        <w:rPr>
+          <w:rFonts w:cs="Arial"/>
+        </w:rPr>
+        <w:t>Lademodul</w:t>
+      </w:r>
+    </w:p>
+    <w:p>
+      <w:pPr>
+        <w:pStyle w:val="Listenabsatz"/>
+        <w:numPr>
+          <w:ilvl w:val="1"/>
+          <w:numId w:val="11"/>
+        </w:numPr>
+      </w:pPr>
+      <w:r>
+        <w:t xml:space="preserve">Der Plan bei diesen ist das ich 3 </w:t>
+      </w:r>
+      <w:proofErr w:type="spellStart"/>
+      <w:r>
+        <w:t>usb</w:t>
+      </w:r>
+      <w:proofErr w:type="spellEnd"/>
+      <w:r>
+        <w:t xml:space="preserve">-c und 1 </w:t>
+      </w:r>
+      <w:proofErr w:type="spellStart"/>
+      <w:r>
+        <w:t>usb</w:t>
+      </w:r>
+      <w:proofErr w:type="spellEnd"/>
+      <w:r>
+        <w:t>-a Module habe. Sie sollen einfach mit 5V</w:t>
+      </w:r>
+      <w:r>
+        <w:t>/2A</w:t>
+      </w:r>
+      <w:r>
+        <w:t xml:space="preserve"> funktionieren.</w:t>
+      </w:r>
+    </w:p>
+    <w:p>
+      <w:pPr>
+        <w:pStyle w:val="berschrift20"/>
+        <w:rPr>
+          <w:rFonts w:cs="Arial"/>
+        </w:rPr>
+      </w:pPr>
+    </w:p>
+    <w:p>
+      <w:pPr>
+        <w:pStyle w:val="berschrift10"/>
+        <w:rPr>
+          <w:rFonts w:cs="Arial"/>
+        </w:rPr>
+      </w:pPr>
+      <w:bookmarkStart w:id="21" w:name="_Toc240287894"/>
+      <w:r>
+        <w:rPr>
+          <w:rFonts w:cs="Arial"/>
+        </w:rPr>
+        <w:t>Steuerelement</w:t>
+      </w:r>
+      <w:bookmarkEnd w:id="21"/>
+    </w:p>
+    <w:p>
+      <w:pPr>
+        <w:pStyle w:val="berschrift10"/>
+        <w:rPr>
+          <w:rFonts w:cs="Arial"/>
+        </w:rPr>
+      </w:pPr>
+      <w:bookmarkStart w:id="22" w:name="_Toc240287895"/>
+      <w:r>
+        <w:rPr>
+          <w:rFonts w:cs="Arial"/>
+        </w:rPr>
+        <w:t>Temperaturmesser</w:t>
+      </w:r>
+      <w:bookmarkEnd w:id="22"/>
+    </w:p>
+    <w:p>
+      <w:pPr>
+        <w:pStyle w:val="berschrift10"/>
+        <w:rPr>
+          <w:rFonts w:cs="Arial"/>
+          <w:b/>
+          <w:bCs/>
+        </w:rPr>
+      </w:pPr>
+      <w:bookmarkStart w:id="23" w:name="_Toc240287896"/>
+      <w:r>
+        <w:rPr>
+          <w:rFonts w:cs="Arial"/>
+        </w:rPr>
+        <w:t>Darstellung</w:t>
+      </w:r>
+      <w:bookmarkEnd w:id="23"/>
+    </w:p>
+    <w:p>
+      <w:pPr>
+        <w:pStyle w:val="berschrift10"/>
+        <w:rPr>
+          <w:rFonts w:cs="Arial"/>
+          <w:b/>
+          <w:bCs/>
+        </w:rPr>
+      </w:pPr>
+      <w:bookmarkStart w:id="24" w:name="_Toc240287897"/>
+      <w:r>
+        <w:rPr>
+          <w:rFonts w:cs="Arial"/>
+        </w:rPr>
+        <w:t>Stromversorgung</w:t>
+      </w:r>
+      <w:bookmarkEnd w:id="24"/>
+    </w:p>
+    <w:p>
+      <w:pPr>
+        <w:pStyle w:val="berschrift10"/>
+        <w:rPr>
+          <w:rFonts w:cs="Arial"/>
+        </w:rPr>
+      </w:pPr>
+      <w:bookmarkStart w:id="25" w:name="_Toc240287898"/>
+      <w:r>
+        <w:rPr>
+          <w:rFonts w:cs="Arial"/>
+        </w:rPr>
+        <w:t>Steuerung des Displays</w:t>
+      </w:r>
+      <w:bookmarkEnd w:id="25"/>
+    </w:p>
+    <w:p>
+      <w:pPr>
+        <w:pStyle w:val="berschrift10"/>
+        <w:rPr>
+          <w:rFonts w:cs="Arial"/>
+        </w:rPr>
+      </w:pPr>
+      <w:bookmarkStart w:id="26" w:name="_Toc240287899"/>
+      <w:r>
+        <w:rPr>
+          <w:rFonts w:cs="Arial"/>
+        </w:rPr>
+        <w:t>Strommessung</w:t>
+      </w:r>
+      <w:r>
+        <w:rPr>
+          <w:rFonts w:cs="Arial"/>
+        </w:rPr>
+        <w:t xml:space="preserve"> (INA219)</w:t>
+      </w:r>
+      <w:r>
+        <w:rPr>
+          <w:rFonts w:cs="Arial"/>
+        </w:rPr>
+        <w:t>:</w:t>
+      </w:r>
+      <w:bookmarkEnd w:id="26"/>
+    </w:p>
+    <w:p>
+      <w:pPr>
+        <w:pStyle w:val="Listenabsatz"/>
+        <w:numPr>
+          <w:ilvl w:val="0"/>
+          <w:numId w:val="11"/>
+        </w:numPr>
+        <w:rPr>
+          <w:rFonts w:ascii="Arial" w:hAnsi="Arial" w:cs="Arial"/>
+        </w:rPr>
+      </w:pPr>
+      <w:r>
+        <w:rPr>
+          <w:rFonts w:ascii="Arial" w:hAnsi="Arial" w:cs="Arial"/>
+        </w:rPr>
+        <w:t xml:space="preserve">In Frage kommt der INA219 oder ACS712 wobei der ACS eher für größere Strommengen gedacht ist was sich für dieses Projekt eher lohnt. </w:t>
+      </w:r>
+    </w:p>
+    <w:p>
+      <w:pPr>
+        <w:pStyle w:val="Listenabsatz"/>
+        <w:numPr>
+          <w:ilvl w:val="0"/>
+          <w:numId w:val="11"/>
+        </w:numPr>
+        <w:rPr>
+          <w:rFonts w:ascii="Arial" w:hAnsi="Arial" w:cs="Arial"/>
+        </w:rPr>
+      </w:pPr>
+      <w:r>
+        <w:rPr>
+          <w:rFonts w:ascii="Arial" w:hAnsi="Arial" w:cs="Arial"/>
+        </w:rPr>
+        <w:t xml:space="preserve">Im Moment muss ich mir überlegen, ob ich den INA219 oder INA INA226 oder INA228 nehme, </w:t>
+      </w:r>
+      <w:hyperlink r:id="rId8" w:history="1">
+        <w:r>
+          <w:rPr>
+            <w:rStyle w:val="Hyperlink"/>
+            <w:rFonts w:ascii="Arial" w:hAnsi="Arial" w:cs="Arial"/>
+          </w:rPr>
+          <w:t>KI-Einsatz\KI-Vergleich INA219, INA226 und INA228.md</w:t>
+        </w:r>
+      </w:hyperlink>
+    </w:p>
+    <w:p>
+      <w:pPr>
+        <w:pStyle w:val="Listenabsatz"/>
+        <w:numPr>
+          <w:ilvl w:val="0"/>
+          <w:numId w:val="11"/>
+        </w:numPr>
+        <w:rPr>
+          <w:rFonts w:ascii="Arial" w:hAnsi="Arial" w:cs="Arial"/>
+        </w:rPr>
+      </w:pPr>
+      <w:r>
+        <w:rPr>
+          <w:rFonts w:ascii="Arial" w:hAnsi="Arial" w:cs="Arial"/>
+        </w:rPr>
+        <w:t>Ich habe mich für den INA 219 entschieden den dieser ist ausreichend für das Projekt und die billigste. Das Genaue Modell wird dann noch je nach Preiß ausgewählt und bestellt.</w:t>
+      </w:r>
+    </w:p>
+    <w:p>
+      <w:pPr>
+        <w:ind w:left="1080"/>
         <w:rPr>
           <w:rFonts w:ascii="Arial" w:hAnsi="Arial" w:cs="Arial"/>
         </w:rPr>
@@ -1568,6 +3773,56 @@
 </w:document>
 </file>
 
+<file path=word/endnotes.xml><?xml version="1.0" encoding="utf-8"?>
+<w:endnotes xmlns:wpc="http://schemas.microsoft.com/office/word/2010/wordprocessingCanvas" xmlns:cx="http://schemas.microsoft.com/office/drawing/2014/chartex" xmlns:cx1="http://schemas.microsoft.com/office/drawing/2015/9/8/chartex" xmlns:cx2="http://schemas.microsoft.com/office/drawing/2015/10/21/chartex" xmlns:cx3="http://schemas.microsoft.com/office/drawing/2016/5/9/chartex" xmlns:cx4="http://schemas.microsoft.com/office/drawing/2016/5/10/chartex" xmlns:cx5="http://schemas.microsoft.com/office/drawing/2016/5/11/chartex" xmlns:cx6="http://schemas.microsoft.com/office/drawing/2016/5/12/chartex" xmlns:cx7="http://schemas.microsoft.com/office/drawing/2016/5/13/chartex" xmlns:cx8="http://schemas.microsoft.com/office/drawing/2016/5/14/chartex" xmlns:mc="http://schemas.openxmlformats.org/markup-compatibility/2006" xmlns:aink="http://schemas.microsoft.com/office/drawing/2016/ink" xmlns:am3d="http://schemas.microsoft.com/office/drawing/2017/model3d" xmlns:o="urn:schemas-microsoft-com:office:office" xmlns:oel="http://schemas.microsoft.com/office/2019/extlst" xmlns:r="http://schemas.openxmlformats.org/officeDocument/2006/relationships" xmlns:m="http://schemas.openxmlformats.org/officeDocument/2006/math" xmlns:v="urn:schemas-microsoft-com:vml" xmlns:wp14="http://schemas.microsoft.com/office/word/2010/wordprocessingDrawing" xmlns:wp="http://schemas.openxmlformats.org/drawingml/2006/wordprocessingDrawing" xmlns:w10="urn:schemas-microsoft-com:office:word" xmlns:w="http://schemas.openxmlformats.org/wordprocessingml/2006/main" xmlns:w14="http://schemas.microsoft.com/office/word/2010/wordml" xmlns:w15="http://schemas.microsoft.com/office/word/2012/wordml" xmlns:w16cex="http://schemas.microsoft.com/office/word/2018/wordml/cex" xmlns:w16cid="http://schemas.microsoft.com/office/word/2016/wordml/cid" xmlns:w16="http://schemas.microsoft.com/office/word/2018/wordml" xmlns:w16du="http://schemas.microsoft.com/office/word/2023/wordml/word16du" xmlns:w16sdtdh="http://schemas.microsoft.com/office/word/2020/wordml/sdtdatahash" xmlns:w16sdtfl="http://schemas.microsoft.com/office/word/2024/wordml/sdtformatlock" xmlns:w16se="http://schemas.microsoft.com/office/word/2015/wordml/symex" xmlns:wpg="http://schemas.microsoft.com/office/word/2010/wordprocessingGroup" xmlns:wpi="http://schemas.microsoft.com/office/word/2010/wordprocessingInk" xmlns:wne="http://schemas.microsoft.com/office/word/2006/wordml" xmlns:wps="http://schemas.microsoft.com/office/word/2010/wordprocessingShape" mc:Ignorable="w14 w15 w16se w16cid w16 w16cex w16sdtdh w16sdtfl w16du wp14">
+  <w:endnote w:type="separator" w:id="-1">
+    <w:p>
+      <w:pPr>
+        <w:spacing w:after="0" w:line="240" w:lineRule="auto"/>
+      </w:pPr>
+      <w:r>
+        <w:separator/>
+      </w:r>
+    </w:p>
+  </w:endnote>
+  <w:endnote w:type="continuationSeparator" w:id="0">
+    <w:p>
+      <w:pPr>
+        <w:spacing w:after="0" w:line="240" w:lineRule="auto"/>
+      </w:pPr>
+      <w:r>
+        <w:continuationSeparator/>
+      </w:r>
+    </w:p>
+  </w:endnote>
+</w:endnotes>
+</file>
+
+<file path=word/footnotes.xml><?xml version="1.0" encoding="utf-8"?>
+<w:footnotes xmlns:wpc="http://schemas.microsoft.com/office/word/2010/wordprocessingCanvas" xmlns:cx="http://schemas.microsoft.com/office/drawing/2014/chartex" xmlns:cx1="http://schemas.microsoft.com/office/drawing/2015/9/8/chartex" xmlns:cx2="http://schemas.microsoft.com/office/drawing/2015/10/21/chartex" xmlns:cx3="http://schemas.microsoft.com/office/drawing/2016/5/9/chartex" xmlns:cx4="http://schemas.microsoft.com/office/drawing/2016/5/10/chartex" xmlns:cx5="http://schemas.microsoft.com/office/drawing/2016/5/11/chartex" xmlns:cx6="http://schemas.microsoft.com/office/drawing/2016/5/12/chartex" xmlns:cx7="http://schemas.microsoft.com/office/drawing/2016/5/13/chartex" xmlns:cx8="http://schemas.microsoft.com/office/drawing/2016/5/14/chartex" xmlns:mc="http://schemas.openxmlformats.org/markup-compatibility/2006" xmlns:aink="http://schemas.microsoft.com/office/drawing/2016/ink" xmlns:am3d="http://schemas.microsoft.com/office/drawing/2017/model3d" xmlns:o="urn:schemas-microsoft-com:office:office" xmlns:oel="http://schemas.microsoft.com/office/2019/extlst" xmlns:r="http://schemas.openxmlformats.org/officeDocument/2006/relationships" xmlns:m="http://schemas.openxmlformats.org/officeDocument/2006/math" xmlns:v="urn:schemas-microsoft-com:vml" xmlns:wp14="http://schemas.microsoft.com/office/word/2010/wordprocessingDrawing" xmlns:wp="http://schemas.openxmlformats.org/drawingml/2006/wordprocessingDrawing" xmlns:w10="urn:schemas-microsoft-com:office:word" xmlns:w="http://schemas.openxmlformats.org/wordprocessingml/2006/main" xmlns:w14="http://schemas.microsoft.com/office/word/2010/wordml" xmlns:w15="http://schemas.microsoft.com/office/word/2012/wordml" xmlns:w16cex="http://schemas.microsoft.com/office/word/2018/wordml/cex" xmlns:w16cid="http://schemas.microsoft.com/office/word/2016/wordml/cid" xmlns:w16="http://schemas.microsoft.com/office/word/2018/wordml" xmlns:w16du="http://schemas.microsoft.com/office/word/2023/wordml/word16du" xmlns:w16sdtdh="http://schemas.microsoft.com/office/word/2020/wordml/sdtdatahash" xmlns:w16sdtfl="http://schemas.microsoft.com/office/word/2024/wordml/sdtformatlock" xmlns:w16se="http://schemas.microsoft.com/office/word/2015/wordml/symex" xmlns:wpg="http://schemas.microsoft.com/office/word/2010/wordprocessingGroup" xmlns:wpi="http://schemas.microsoft.com/office/word/2010/wordprocessingInk" xmlns:wne="http://schemas.microsoft.com/office/word/2006/wordml" xmlns:wps="http://schemas.microsoft.com/office/word/2010/wordprocessingShape" mc:Ignorable="w14 w15 w16se w16cid w16 w16cex w16sdtdh w16sdtfl w16du wp14">
+  <w:footnote w:type="separator" w:id="-1">
+    <w:p>
+      <w:pPr>
+        <w:spacing w:after="0" w:line="240" w:lineRule="auto"/>
+      </w:pPr>
+      <w:r>
+        <w:separator/>
+      </w:r>
+    </w:p>
+  </w:footnote>
+  <w:footnote w:type="continuationSeparator" w:id="0">
+    <w:p>
+      <w:pPr>
+        <w:spacing w:after="0" w:line="240" w:lineRule="auto"/>
+      </w:pPr>
+      <w:r>
+        <w:continuationSeparator/>
+      </w:r>
+    </w:p>
+  </w:footnote>
+</w:footnotes>
+</file>
+
 <file path=word/numbering.xml><?xml version="1.0" encoding="utf-8"?>
 <w:numbering xmlns:wpc="http://schemas.microsoft.com/office/word/2010/wordprocessingCanvas" xmlns:cx="http://schemas.microsoft.com/office/drawing/2014/chartex" xmlns:cx1="http://schemas.microsoft.com/office/drawing/2015/9/8/chartex" xmlns:cx2="http://schemas.microsoft.com/office/drawing/2015/10/21/chartex" xmlns:cx3="http://schemas.microsoft.com/office/drawing/2016/5/9/chartex" xmlns:cx4="http://schemas.microsoft.com/office/drawing/2016/5/10/chartex" xmlns:cx5="http://schemas.microsoft.com/office/drawing/2016/5/11/chartex" xmlns:cx6="http://schemas.microsoft.com/office/drawing/2016/5/12/chartex" xmlns:cx7="http://schemas.microsoft.com/office/drawing/2016/5/13/chartex" xmlns:cx8="http://schemas.microsoft.com/office/drawing/2016/5/14/chartex" xmlns:mc="http://schemas.openxmlformats.org/markup-compatibility/2006" xmlns:aink="http://schemas.microsoft.com/office/drawing/2016/ink" xmlns:am3d="http://schemas.microsoft.com/office/drawing/2017/model3d" xmlns:o="urn:schemas-microsoft-com:office:office" xmlns:oel="http://schemas.microsoft.com/office/2019/extlst" xmlns:r="http://schemas.openxmlformats.org/officeDocument/2006/relationships" xmlns:m="http://schemas.openxmlformats.org/officeDocument/2006/math" xmlns:v="urn:schemas-microsoft-com:vml" xmlns:wp14="http://schemas.microsoft.com/office/word/2010/wordprocessingDrawing" xmlns:wp="http://schemas.openxmlformats.org/drawingml/2006/wordprocessingDrawing" xmlns:w10="urn:schemas-microsoft-com:office:word" xmlns:w="http://schemas.openxmlformats.org/wordprocessingml/2006/main" xmlns:w14="http://schemas.microsoft.com/office/word/2010/wordml" xmlns:w15="http://schemas.microsoft.com/office/word/2012/wordml" xmlns:w16cex="http://schemas.microsoft.com/office/word/2018/wordml/cex" xmlns:w16cid="http://schemas.microsoft.com/office/word/2016/wordml/cid" xmlns:w16="http://schemas.microsoft.com/office/word/2018/wordml" xmlns:w16du="http://schemas.microsoft.com/office/word/2023/wordml/word16du" xmlns:w16sdtdh="http://schemas.microsoft.com/office/word/2020/wordml/sdtdatahash" xmlns:w16sdtfl="http://schemas.microsoft.com/office/word/2024/wordml/sdtformatlock" xmlns:w16se="http://schemas.microsoft.com/office/word/2015/wordml/symex" xmlns:wpg="http://schemas.microsoft.com/office/word/2010/wordprocessingGroup" xmlns:wpi="http://schemas.microsoft.com/office/word/2010/wordprocessingInk" xmlns:wne="http://schemas.microsoft.com/office/word/2006/wordml" xmlns:wps="http://schemas.microsoft.com/office/word/2010/wordprocessingShape" mc:Ignorable="w14 w15 w16se w16cid w16 w16cex w16sdtdh w16sdtfl w16du wp14">
   <w:abstractNum w:abstractNumId="0" w15:restartNumberingAfterBreak="0">
@@ -1684,6 +3939,232 @@
     </w:lvl>
   </w:abstractNum>
   <w:abstractNum w:abstractNumId="1" w15:restartNumberingAfterBreak="0">
+    <w:nsid w:val="1847099C"/>
+    <w:multiLevelType w:val="hybridMultilevel"/>
+    <w:tmpl w:val="DE98F98A"/>
+    <w:lvl w:ilvl="0" w:tplc="57523C72">
+      <w:start w:val="1"/>
+      <w:numFmt w:val="bullet"/>
+      <w:lvlText w:val=""/>
+      <w:lvlJc w:val="left"/>
+      <w:pPr>
+        <w:ind w:left="720" w:hanging="360"/>
+      </w:pPr>
+      <w:rPr>
+        <w:rFonts w:ascii="Symbol" w:hAnsi="Symbol" w:hint="default"/>
+      </w:rPr>
+    </w:lvl>
+    <w:lvl w:ilvl="1" w:tplc="CC322B7C">
+      <w:start w:val="1"/>
+      <w:numFmt w:val="bullet"/>
+      <w:lvlText w:val="o"/>
+      <w:lvlJc w:val="left"/>
+      <w:pPr>
+        <w:ind w:left="1440" w:hanging="360"/>
+      </w:pPr>
+      <w:rPr>
+        <w:rFonts w:ascii="Courier New" w:hAnsi="Courier New" w:cs="Courier New" w:hint="default"/>
+      </w:rPr>
+    </w:lvl>
+    <w:lvl w:ilvl="2" w:tplc="04070005">
+      <w:start w:val="1"/>
+      <w:numFmt w:val="bullet"/>
+      <w:lvlText w:val=""/>
+      <w:lvlJc w:val="left"/>
+      <w:pPr>
+        <w:ind w:left="2160" w:hanging="360"/>
+      </w:pPr>
+      <w:rPr>
+        <w:rFonts w:ascii="Wingdings" w:hAnsi="Wingdings" w:hint="default"/>
+      </w:rPr>
+    </w:lvl>
+    <w:lvl w:ilvl="3" w:tplc="04070001">
+      <w:start w:val="1"/>
+      <w:numFmt w:val="bullet"/>
+      <w:lvlText w:val=""/>
+      <w:lvlJc w:val="left"/>
+      <w:pPr>
+        <w:ind w:left="2880" w:hanging="360"/>
+      </w:pPr>
+      <w:rPr>
+        <w:rFonts w:ascii="Symbol" w:hAnsi="Symbol" w:hint="default"/>
+      </w:rPr>
+    </w:lvl>
+    <w:lvl w:ilvl="4" w:tplc="04070003" w:tentative="1">
+      <w:start w:val="1"/>
+      <w:numFmt w:val="bullet"/>
+      <w:lvlText w:val="o"/>
+      <w:lvlJc w:val="left"/>
+      <w:pPr>
+        <w:ind w:left="3600" w:hanging="360"/>
+      </w:pPr>
+      <w:rPr>
+        <w:rFonts w:ascii="Courier New" w:hAnsi="Courier New" w:cs="Courier New" w:hint="default"/>
+      </w:rPr>
+    </w:lvl>
+    <w:lvl w:ilvl="5" w:tplc="04070005" w:tentative="1">
+      <w:start w:val="1"/>
+      <w:numFmt w:val="bullet"/>
+      <w:lvlText w:val=""/>
+      <w:lvlJc w:val="left"/>
+      <w:pPr>
+        <w:ind w:left="4320" w:hanging="360"/>
+      </w:pPr>
+      <w:rPr>
+        <w:rFonts w:ascii="Wingdings" w:hAnsi="Wingdings" w:hint="default"/>
+      </w:rPr>
+    </w:lvl>
+    <w:lvl w:ilvl="6" w:tplc="04070001" w:tentative="1">
+      <w:start w:val="1"/>
+      <w:numFmt w:val="bullet"/>
+      <w:lvlText w:val=""/>
+      <w:lvlJc w:val="left"/>
+      <w:pPr>
+        <w:ind w:left="5040" w:hanging="360"/>
+      </w:pPr>
+      <w:rPr>
+        <w:rFonts w:ascii="Symbol" w:hAnsi="Symbol" w:hint="default"/>
+      </w:rPr>
+    </w:lvl>
+    <w:lvl w:ilvl="7" w:tplc="04070003" w:tentative="1">
+      <w:start w:val="1"/>
+      <w:numFmt w:val="bullet"/>
+      <w:lvlText w:val="o"/>
+      <w:lvlJc w:val="left"/>
+      <w:pPr>
+        <w:ind w:left="5760" w:hanging="360"/>
+      </w:pPr>
+      <w:rPr>
+        <w:rFonts w:ascii="Courier New" w:hAnsi="Courier New" w:cs="Courier New" w:hint="default"/>
+      </w:rPr>
+    </w:lvl>
+    <w:lvl w:ilvl="8" w:tplc="04070005" w:tentative="1">
+      <w:start w:val="1"/>
+      <w:numFmt w:val="bullet"/>
+      <w:lvlText w:val=""/>
+      <w:lvlJc w:val="left"/>
+      <w:pPr>
+        <w:ind w:left="6480" w:hanging="360"/>
+      </w:pPr>
+      <w:rPr>
+        <w:rFonts w:ascii="Wingdings" w:hAnsi="Wingdings" w:hint="default"/>
+      </w:rPr>
+    </w:lvl>
+  </w:abstractNum>
+  <w:abstractNum w:abstractNumId="2" w15:restartNumberingAfterBreak="0">
+    <w:nsid w:val="1CFB020E"/>
+    <w:multiLevelType w:val="hybridMultilevel"/>
+    <w:tmpl w:val="34B69D3E"/>
+    <w:lvl w:ilvl="0" w:tplc="04070001">
+      <w:start w:val="1"/>
+      <w:numFmt w:val="bullet"/>
+      <w:lvlText w:val=""/>
+      <w:lvlJc w:val="left"/>
+      <w:pPr>
+        <w:ind w:left="360" w:hanging="360"/>
+      </w:pPr>
+      <w:rPr>
+        <w:rFonts w:ascii="Symbol" w:hAnsi="Symbol" w:hint="default"/>
+      </w:rPr>
+    </w:lvl>
+    <w:lvl w:ilvl="1" w:tplc="04070003" w:tentative="1">
+      <w:start w:val="1"/>
+      <w:numFmt w:val="bullet"/>
+      <w:lvlText w:val="o"/>
+      <w:lvlJc w:val="left"/>
+      <w:pPr>
+        <w:ind w:left="1080" w:hanging="360"/>
+      </w:pPr>
+      <w:rPr>
+        <w:rFonts w:ascii="Courier New" w:hAnsi="Courier New" w:cs="Courier New" w:hint="default"/>
+      </w:rPr>
+    </w:lvl>
+    <w:lvl w:ilvl="2" w:tplc="04070005" w:tentative="1">
+      <w:start w:val="1"/>
+      <w:numFmt w:val="bullet"/>
+      <w:lvlText w:val=""/>
+      <w:lvlJc w:val="left"/>
+      <w:pPr>
+        <w:ind w:left="1800" w:hanging="360"/>
+      </w:pPr>
+      <w:rPr>
+        <w:rFonts w:ascii="Wingdings" w:hAnsi="Wingdings" w:hint="default"/>
+      </w:rPr>
+    </w:lvl>
+    <w:lvl w:ilvl="3" w:tplc="04070001" w:tentative="1">
+      <w:start w:val="1"/>
+      <w:numFmt w:val="bullet"/>
+      <w:lvlText w:val=""/>
+      <w:lvlJc w:val="left"/>
+      <w:pPr>
+        <w:ind w:left="2520" w:hanging="360"/>
+      </w:pPr>
+      <w:rPr>
+        <w:rFonts w:ascii="Symbol" w:hAnsi="Symbol" w:hint="default"/>
+      </w:rPr>
+    </w:lvl>
+    <w:lvl w:ilvl="4" w:tplc="04070003" w:tentative="1">
+      <w:start w:val="1"/>
+      <w:numFmt w:val="bullet"/>
+      <w:lvlText w:val="o"/>
+      <w:lvlJc w:val="left"/>
+      <w:pPr>
+        <w:ind w:left="3240" w:hanging="360"/>
+      </w:pPr>
+      <w:rPr>
+        <w:rFonts w:ascii="Courier New" w:hAnsi="Courier New" w:cs="Courier New" w:hint="default"/>
+      </w:rPr>
+    </w:lvl>
+    <w:lvl w:ilvl="5" w:tplc="04070005" w:tentative="1">
+      <w:start w:val="1"/>
+      <w:numFmt w:val="bullet"/>
+      <w:lvlText w:val=""/>
+      <w:lvlJc w:val="left"/>
+      <w:pPr>
+        <w:ind w:left="3960" w:hanging="360"/>
+      </w:pPr>
+      <w:rPr>
+        <w:rFonts w:ascii="Wingdings" w:hAnsi="Wingdings" w:hint="default"/>
+      </w:rPr>
+    </w:lvl>
+    <w:lvl w:ilvl="6" w:tplc="04070001" w:tentative="1">
+      <w:start w:val="1"/>
+      <w:numFmt w:val="bullet"/>
+      <w:lvlText w:val=""/>
+      <w:lvlJc w:val="left"/>
+      <w:pPr>
+        <w:ind w:left="4680" w:hanging="360"/>
+      </w:pPr>
+      <w:rPr>
+        <w:rFonts w:ascii="Symbol" w:hAnsi="Symbol" w:hint="default"/>
+      </w:rPr>
+    </w:lvl>
+    <w:lvl w:ilvl="7" w:tplc="04070003" w:tentative="1">
+      <w:start w:val="1"/>
+      <w:numFmt w:val="bullet"/>
+      <w:lvlText w:val="o"/>
+      <w:lvlJc w:val="left"/>
+      <w:pPr>
+        <w:ind w:left="5400" w:hanging="360"/>
+      </w:pPr>
+      <w:rPr>
+        <w:rFonts w:ascii="Courier New" w:hAnsi="Courier New" w:cs="Courier New" w:hint="default"/>
+      </w:rPr>
+    </w:lvl>
+    <w:lvl w:ilvl="8" w:tplc="04070005" w:tentative="1">
+      <w:start w:val="1"/>
+      <w:numFmt w:val="bullet"/>
+      <w:lvlText w:val=""/>
+      <w:lvlJc w:val="left"/>
+      <w:pPr>
+        <w:ind w:left="6120" w:hanging="360"/>
+      </w:pPr>
+      <w:rPr>
+        <w:rFonts w:ascii="Wingdings" w:hAnsi="Wingdings" w:hint="default"/>
+      </w:rPr>
+    </w:lvl>
+  </w:abstractNum>
+  <w:abstractNum w:abstractNumId="3" w15:restartNumberingAfterBreak="0">
     <w:nsid w:val="27F1025D"/>
     <w:multiLevelType w:val="hybridMultilevel"/>
     <w:tmpl w:val="D2F6B3D8"/>
@@ -1796,7 +4277,7 @@
       </w:rPr>
     </w:lvl>
   </w:abstractNum>
-  <w:abstractNum w:abstractNumId="2" w15:restartNumberingAfterBreak="0">
+  <w:abstractNum w:abstractNumId="4" w15:restartNumberingAfterBreak="0">
     <w:nsid w:val="2AEF4CE2"/>
     <w:multiLevelType w:val="hybridMultilevel"/>
     <w:tmpl w:val="8318B592"/>
@@ -1909,7 +4390,120 @@
       </w:rPr>
     </w:lvl>
   </w:abstractNum>
-  <w:abstractNum w:abstractNumId="3" w15:restartNumberingAfterBreak="0">
+  <w:abstractNum w:abstractNumId="5" w15:restartNumberingAfterBreak="0">
+    <w:nsid w:val="3B794007"/>
+    <w:multiLevelType w:val="hybridMultilevel"/>
+    <w:tmpl w:val="1716181E"/>
+    <w:lvl w:ilvl="0" w:tplc="04070001">
+      <w:start w:val="1"/>
+      <w:numFmt w:val="bullet"/>
+      <w:lvlText w:val=""/>
+      <w:lvlJc w:val="left"/>
+      <w:pPr>
+        <w:ind w:left="720" w:hanging="360"/>
+      </w:pPr>
+      <w:rPr>
+        <w:rFonts w:ascii="Symbol" w:hAnsi="Symbol" w:hint="default"/>
+      </w:rPr>
+    </w:lvl>
+    <w:lvl w:ilvl="1" w:tplc="04070003" w:tentative="1">
+      <w:start w:val="1"/>
+      <w:numFmt w:val="bullet"/>
+      <w:lvlText w:val="o"/>
+      <w:lvlJc w:val="left"/>
+      <w:pPr>
+        <w:ind w:left="1440" w:hanging="360"/>
+      </w:pPr>
+      <w:rPr>
+        <w:rFonts w:ascii="Courier New" w:hAnsi="Courier New" w:cs="Courier New" w:hint="default"/>
+      </w:rPr>
+    </w:lvl>
+    <w:lvl w:ilvl="2" w:tplc="04070005" w:tentative="1">
+      <w:start w:val="1"/>
+      <w:numFmt w:val="bullet"/>
+      <w:lvlText w:val=""/>
+      <w:lvlJc w:val="left"/>
+      <w:pPr>
+        <w:ind w:left="2160" w:hanging="360"/>
+      </w:pPr>
+      <w:rPr>
+        <w:rFonts w:ascii="Wingdings" w:hAnsi="Wingdings" w:hint="default"/>
+      </w:rPr>
+    </w:lvl>
+    <w:lvl w:ilvl="3" w:tplc="04070001" w:tentative="1">
+      <w:start w:val="1"/>
+      <w:numFmt w:val="bullet"/>
+      <w:lvlText w:val=""/>
+      <w:lvlJc w:val="left"/>
+      <w:pPr>
+        <w:ind w:left="2880" w:hanging="360"/>
+      </w:pPr>
+      <w:rPr>
+        <w:rFonts w:ascii="Symbol" w:hAnsi="Symbol" w:hint="default"/>
+      </w:rPr>
+    </w:lvl>
+    <w:lvl w:ilvl="4" w:tplc="04070003" w:tentative="1">
+      <w:start w:val="1"/>
+      <w:numFmt w:val="bullet"/>
+      <w:lvlText w:val="o"/>
+      <w:lvlJc w:val="left"/>
+      <w:pPr>
+        <w:ind w:left="3600" w:hanging="360"/>
+      </w:pPr>
+      <w:rPr>
+        <w:rFonts w:ascii="Courier New" w:hAnsi="Courier New" w:cs="Courier New" w:hint="default"/>
+      </w:rPr>
+    </w:lvl>
+    <w:lvl w:ilvl="5" w:tplc="04070005" w:tentative="1">
+      <w:start w:val="1"/>
+      <w:numFmt w:val="bullet"/>
+      <w:lvlText w:val=""/>
+      <w:lvlJc w:val="left"/>
+      <w:pPr>
+        <w:ind w:left="4320" w:hanging="360"/>
+      </w:pPr>
+      <w:rPr>
+        <w:rFonts w:ascii="Wingdings" w:hAnsi="Wingdings" w:hint="default"/>
+      </w:rPr>
+    </w:lvl>
+    <w:lvl w:ilvl="6" w:tplc="04070001" w:tentative="1">
+      <w:start w:val="1"/>
+      <w:numFmt w:val="bullet"/>
+      <w:lvlText w:val=""/>
+      <w:lvlJc w:val="left"/>
+      <w:pPr>
+        <w:ind w:left="5040" w:hanging="360"/>
+      </w:pPr>
+      <w:rPr>
+        <w:rFonts w:ascii="Symbol" w:hAnsi="Symbol" w:hint="default"/>
+      </w:rPr>
+    </w:lvl>
+    <w:lvl w:ilvl="7" w:tplc="04070003" w:tentative="1">
+      <w:start w:val="1"/>
+      <w:numFmt w:val="bullet"/>
+      <w:lvlText w:val="o"/>
+      <w:lvlJc w:val="left"/>
+      <w:pPr>
+        <w:ind w:left="5760" w:hanging="360"/>
+      </w:pPr>
+      <w:rPr>
+        <w:rFonts w:ascii="Courier New" w:hAnsi="Courier New" w:cs="Courier New" w:hint="default"/>
+      </w:rPr>
+    </w:lvl>
+    <w:lvl w:ilvl="8" w:tplc="04070005" w:tentative="1">
+      <w:start w:val="1"/>
+      <w:numFmt w:val="bullet"/>
+      <w:lvlText w:val=""/>
+      <w:lvlJc w:val="left"/>
+      <w:pPr>
+        <w:ind w:left="6480" w:hanging="360"/>
+      </w:pPr>
+      <w:rPr>
+        <w:rFonts w:ascii="Wingdings" w:hAnsi="Wingdings" w:hint="default"/>
+      </w:rPr>
+    </w:lvl>
+  </w:abstractNum>
+  <w:abstractNum w:abstractNumId="6" w15:restartNumberingAfterBreak="0">
     <w:nsid w:val="3F9A48C0"/>
     <w:multiLevelType w:val="hybridMultilevel"/>
     <w:tmpl w:val="4F92EC14"/>
@@ -2022,7 +4616,7 @@
       </w:rPr>
     </w:lvl>
   </w:abstractNum>
-  <w:abstractNum w:abstractNumId="4" w15:restartNumberingAfterBreak="0">
+  <w:abstractNum w:abstractNumId="7" w15:restartNumberingAfterBreak="0">
     <w:nsid w:val="4DA04664"/>
     <w:multiLevelType w:val="hybridMultilevel"/>
     <w:tmpl w:val="3D820456"/>
@@ -2135,7 +4729,233 @@
       </w:rPr>
     </w:lvl>
   </w:abstractNum>
-  <w:abstractNum w:abstractNumId="5" w15:restartNumberingAfterBreak="0">
+  <w:abstractNum w:abstractNumId="8" w15:restartNumberingAfterBreak="0">
+    <w:nsid w:val="564424A9"/>
+    <w:multiLevelType w:val="hybridMultilevel"/>
+    <w:tmpl w:val="56BA9FB4"/>
+    <w:lvl w:ilvl="0" w:tplc="CC322B7C">
+      <w:start w:val="1"/>
+      <w:numFmt w:val="bullet"/>
+      <w:lvlText w:val="o"/>
+      <w:lvlJc w:val="left"/>
+      <w:pPr>
+        <w:ind w:left="1068" w:hanging="360"/>
+      </w:pPr>
+      <w:rPr>
+        <w:rFonts w:ascii="Courier New" w:hAnsi="Courier New" w:cs="Courier New" w:hint="default"/>
+      </w:rPr>
+    </w:lvl>
+    <w:lvl w:ilvl="1" w:tplc="04070003" w:tentative="1">
+      <w:start w:val="1"/>
+      <w:numFmt w:val="bullet"/>
+      <w:lvlText w:val="o"/>
+      <w:lvlJc w:val="left"/>
+      <w:pPr>
+        <w:ind w:left="1068" w:hanging="360"/>
+      </w:pPr>
+      <w:rPr>
+        <w:rFonts w:ascii="Courier New" w:hAnsi="Courier New" w:cs="Courier New" w:hint="default"/>
+      </w:rPr>
+    </w:lvl>
+    <w:lvl w:ilvl="2" w:tplc="04070005" w:tentative="1">
+      <w:start w:val="1"/>
+      <w:numFmt w:val="bullet"/>
+      <w:lvlText w:val=""/>
+      <w:lvlJc w:val="left"/>
+      <w:pPr>
+        <w:ind w:left="1788" w:hanging="360"/>
+      </w:pPr>
+      <w:rPr>
+        <w:rFonts w:ascii="Wingdings" w:hAnsi="Wingdings" w:hint="default"/>
+      </w:rPr>
+    </w:lvl>
+    <w:lvl w:ilvl="3" w:tplc="04070001" w:tentative="1">
+      <w:start w:val="1"/>
+      <w:numFmt w:val="bullet"/>
+      <w:lvlText w:val=""/>
+      <w:lvlJc w:val="left"/>
+      <w:pPr>
+        <w:ind w:left="2508" w:hanging="360"/>
+      </w:pPr>
+      <w:rPr>
+        <w:rFonts w:ascii="Symbol" w:hAnsi="Symbol" w:hint="default"/>
+      </w:rPr>
+    </w:lvl>
+    <w:lvl w:ilvl="4" w:tplc="04070003" w:tentative="1">
+      <w:start w:val="1"/>
+      <w:numFmt w:val="bullet"/>
+      <w:lvlText w:val="o"/>
+      <w:lvlJc w:val="left"/>
+      <w:pPr>
+        <w:ind w:left="3228" w:hanging="360"/>
+      </w:pPr>
+      <w:rPr>
+        <w:rFonts w:ascii="Courier New" w:hAnsi="Courier New" w:cs="Courier New" w:hint="default"/>
+      </w:rPr>
+    </w:lvl>
+    <w:lvl w:ilvl="5" w:tplc="04070005" w:tentative="1">
+      <w:start w:val="1"/>
+      <w:numFmt w:val="bullet"/>
+      <w:lvlText w:val=""/>
+      <w:lvlJc w:val="left"/>
+      <w:pPr>
+        <w:ind w:left="3948" w:hanging="360"/>
+      </w:pPr>
+      <w:rPr>
+        <w:rFonts w:ascii="Wingdings" w:hAnsi="Wingdings" w:hint="default"/>
+      </w:rPr>
+    </w:lvl>
+    <w:lvl w:ilvl="6" w:tplc="04070001" w:tentative="1">
+      <w:start w:val="1"/>
+      <w:numFmt w:val="bullet"/>
+      <w:lvlText w:val=""/>
+      <w:lvlJc w:val="left"/>
+      <w:pPr>
+        <w:ind w:left="4668" w:hanging="360"/>
+      </w:pPr>
+      <w:rPr>
+        <w:rFonts w:ascii="Symbol" w:hAnsi="Symbol" w:hint="default"/>
+      </w:rPr>
+    </w:lvl>
+    <w:lvl w:ilvl="7" w:tplc="04070003" w:tentative="1">
+      <w:start w:val="1"/>
+      <w:numFmt w:val="bullet"/>
+      <w:lvlText w:val="o"/>
+      <w:lvlJc w:val="left"/>
+      <w:pPr>
+        <w:ind w:left="5388" w:hanging="360"/>
+      </w:pPr>
+      <w:rPr>
+        <w:rFonts w:ascii="Courier New" w:hAnsi="Courier New" w:cs="Courier New" w:hint="default"/>
+      </w:rPr>
+    </w:lvl>
+    <w:lvl w:ilvl="8" w:tplc="04070005" w:tentative="1">
+      <w:start w:val="1"/>
+      <w:numFmt w:val="bullet"/>
+      <w:lvlText w:val=""/>
+      <w:lvlJc w:val="left"/>
+      <w:pPr>
+        <w:ind w:left="6108" w:hanging="360"/>
+      </w:pPr>
+      <w:rPr>
+        <w:rFonts w:ascii="Wingdings" w:hAnsi="Wingdings" w:hint="default"/>
+      </w:rPr>
+    </w:lvl>
+  </w:abstractNum>
+  <w:abstractNum w:abstractNumId="9" w15:restartNumberingAfterBreak="0">
+    <w:nsid w:val="56C17EFA"/>
+    <w:multiLevelType w:val="hybridMultilevel"/>
+    <w:tmpl w:val="23EC5F72"/>
+    <w:lvl w:ilvl="0" w:tplc="CC322B7C">
+      <w:start w:val="1"/>
+      <w:numFmt w:val="bullet"/>
+      <w:lvlText w:val="o"/>
+      <w:lvlJc w:val="left"/>
+      <w:pPr>
+        <w:ind w:left="360" w:hanging="360"/>
+      </w:pPr>
+      <w:rPr>
+        <w:rFonts w:ascii="Courier New" w:hAnsi="Courier New" w:cs="Courier New" w:hint="default"/>
+      </w:rPr>
+    </w:lvl>
+    <w:lvl w:ilvl="1" w:tplc="04070003" w:tentative="1">
+      <w:start w:val="1"/>
+      <w:numFmt w:val="bullet"/>
+      <w:lvlText w:val="o"/>
+      <w:lvlJc w:val="left"/>
+      <w:pPr>
+        <w:ind w:left="360" w:hanging="360"/>
+      </w:pPr>
+      <w:rPr>
+        <w:rFonts w:ascii="Courier New" w:hAnsi="Courier New" w:cs="Courier New" w:hint="default"/>
+      </w:rPr>
+    </w:lvl>
+    <w:lvl w:ilvl="2" w:tplc="04070005" w:tentative="1">
+      <w:start w:val="1"/>
+      <w:numFmt w:val="bullet"/>
+      <w:lvlText w:val=""/>
+      <w:lvlJc w:val="left"/>
+      <w:pPr>
+        <w:ind w:left="1080" w:hanging="360"/>
+      </w:pPr>
+      <w:rPr>
+        <w:rFonts w:ascii="Wingdings" w:hAnsi="Wingdings" w:hint="default"/>
+      </w:rPr>
+    </w:lvl>
+    <w:lvl w:ilvl="3" w:tplc="04070001" w:tentative="1">
+      <w:start w:val="1"/>
+      <w:numFmt w:val="bullet"/>
+      <w:lvlText w:val=""/>
+      <w:lvlJc w:val="left"/>
+      <w:pPr>
+        <w:ind w:left="1800" w:hanging="360"/>
+      </w:pPr>
+      <w:rPr>
+        <w:rFonts w:ascii="Symbol" w:hAnsi="Symbol" w:hint="default"/>
+      </w:rPr>
+    </w:lvl>
+    <w:lvl w:ilvl="4" w:tplc="04070003" w:tentative="1">
+      <w:start w:val="1"/>
+      <w:numFmt w:val="bullet"/>
+      <w:lvlText w:val="o"/>
+      <w:lvlJc w:val="left"/>
+      <w:pPr>
+        <w:ind w:left="2520" w:hanging="360"/>
+      </w:pPr>
+      <w:rPr>
+        <w:rFonts w:ascii="Courier New" w:hAnsi="Courier New" w:cs="Courier New" w:hint="default"/>
+      </w:rPr>
+    </w:lvl>
+    <w:lvl w:ilvl="5" w:tplc="04070005" w:tentative="1">
+      <w:start w:val="1"/>
+      <w:numFmt w:val="bullet"/>
+      <w:lvlText w:val=""/>
+      <w:lvlJc w:val="left"/>
+      <w:pPr>
+        <w:ind w:left="3240" w:hanging="360"/>
+      </w:pPr>
+      <w:rPr>
+        <w:rFonts w:ascii="Wingdings" w:hAnsi="Wingdings" w:hint="default"/>
+      </w:rPr>
+    </w:lvl>
+    <w:lvl w:ilvl="6" w:tplc="04070001" w:tentative="1">
+      <w:start w:val="1"/>
+      <w:numFmt w:val="bullet"/>
+      <w:lvlText w:val=""/>
+      <w:lvlJc w:val="left"/>
+      <w:pPr>
+        <w:ind w:left="3960" w:hanging="360"/>
+      </w:pPr>
+      <w:rPr>
+        <w:rFonts w:ascii="Symbol" w:hAnsi="Symbol" w:hint="default"/>
+      </w:rPr>
+    </w:lvl>
+    <w:lvl w:ilvl="7" w:tplc="04070003" w:tentative="1">
+      <w:start w:val="1"/>
+      <w:numFmt w:val="bullet"/>
+      <w:lvlText w:val="o"/>
+      <w:lvlJc w:val="left"/>
+      <w:pPr>
+        <w:ind w:left="4680" w:hanging="360"/>
+      </w:pPr>
+      <w:rPr>
+        <w:rFonts w:ascii="Courier New" w:hAnsi="Courier New" w:cs="Courier New" w:hint="default"/>
+      </w:rPr>
+    </w:lvl>
+    <w:lvl w:ilvl="8" w:tplc="04070005" w:tentative="1">
+      <w:start w:val="1"/>
+      <w:numFmt w:val="bullet"/>
+      <w:lvlText w:val=""/>
+      <w:lvlJc w:val="left"/>
+      <w:pPr>
+        <w:ind w:left="5400" w:hanging="360"/>
+      </w:pPr>
+      <w:rPr>
+        <w:rFonts w:ascii="Wingdings" w:hAnsi="Wingdings" w:hint="default"/>
+      </w:rPr>
+    </w:lvl>
+  </w:abstractNum>
+  <w:abstractNum w:abstractNumId="10" w15:restartNumberingAfterBreak="0">
     <w:nsid w:val="56D86A6D"/>
     <w:multiLevelType w:val="hybridMultilevel"/>
     <w:tmpl w:val="38C40568"/>
@@ -2248,7 +5068,7 @@
       </w:rPr>
     </w:lvl>
   </w:abstractNum>
-  <w:abstractNum w:abstractNumId="6" w15:restartNumberingAfterBreak="0">
+  <w:abstractNum w:abstractNumId="11" w15:restartNumberingAfterBreak="0">
     <w:nsid w:val="5FFB622F"/>
     <w:multiLevelType w:val="hybridMultilevel"/>
     <w:tmpl w:val="C19AD99C"/>
@@ -2361,7 +5181,120 @@
       </w:rPr>
     </w:lvl>
   </w:abstractNum>
-  <w:abstractNum w:abstractNumId="7" w15:restartNumberingAfterBreak="0">
+  <w:abstractNum w:abstractNumId="12" w15:restartNumberingAfterBreak="0">
+    <w:nsid w:val="60613BAE"/>
+    <w:multiLevelType w:val="hybridMultilevel"/>
+    <w:tmpl w:val="878A2A0E"/>
+    <w:lvl w:ilvl="0" w:tplc="04070001">
+      <w:start w:val="1"/>
+      <w:numFmt w:val="bullet"/>
+      <w:lvlText w:val=""/>
+      <w:lvlJc w:val="left"/>
+      <w:pPr>
+        <w:ind w:left="3600" w:hanging="360"/>
+      </w:pPr>
+      <w:rPr>
+        <w:rFonts w:ascii="Symbol" w:hAnsi="Symbol" w:hint="default"/>
+      </w:rPr>
+    </w:lvl>
+    <w:lvl w:ilvl="1" w:tplc="04070003" w:tentative="1">
+      <w:start w:val="1"/>
+      <w:numFmt w:val="bullet"/>
+      <w:lvlText w:val="o"/>
+      <w:lvlJc w:val="left"/>
+      <w:pPr>
+        <w:ind w:left="4320" w:hanging="360"/>
+      </w:pPr>
+      <w:rPr>
+        <w:rFonts w:ascii="Courier New" w:hAnsi="Courier New" w:cs="Courier New" w:hint="default"/>
+      </w:rPr>
+    </w:lvl>
+    <w:lvl w:ilvl="2" w:tplc="04070005" w:tentative="1">
+      <w:start w:val="1"/>
+      <w:numFmt w:val="bullet"/>
+      <w:lvlText w:val=""/>
+      <w:lvlJc w:val="left"/>
+      <w:pPr>
+        <w:ind w:left="5040" w:hanging="360"/>
+      </w:pPr>
+      <w:rPr>
+        <w:rFonts w:ascii="Wingdings" w:hAnsi="Wingdings" w:hint="default"/>
+      </w:rPr>
+    </w:lvl>
+    <w:lvl w:ilvl="3" w:tplc="04070001" w:tentative="1">
+      <w:start w:val="1"/>
+      <w:numFmt w:val="bullet"/>
+      <w:lvlText w:val=""/>
+      <w:lvlJc w:val="left"/>
+      <w:pPr>
+        <w:ind w:left="5760" w:hanging="360"/>
+      </w:pPr>
+      <w:rPr>
+        <w:rFonts w:ascii="Symbol" w:hAnsi="Symbol" w:hint="default"/>
+      </w:rPr>
+    </w:lvl>
+    <w:lvl w:ilvl="4" w:tplc="04070003" w:tentative="1">
+      <w:start w:val="1"/>
+      <w:numFmt w:val="bullet"/>
+      <w:lvlText w:val="o"/>
+      <w:lvlJc w:val="left"/>
+      <w:pPr>
+        <w:ind w:left="6480" w:hanging="360"/>
+      </w:pPr>
+      <w:rPr>
+        <w:rFonts w:ascii="Courier New" w:hAnsi="Courier New" w:cs="Courier New" w:hint="default"/>
+      </w:rPr>
+    </w:lvl>
+    <w:lvl w:ilvl="5" w:tplc="04070005" w:tentative="1">
+      <w:start w:val="1"/>
+      <w:numFmt w:val="bullet"/>
+      <w:lvlText w:val=""/>
+      <w:lvlJc w:val="left"/>
+      <w:pPr>
+        <w:ind w:left="7200" w:hanging="360"/>
+      </w:pPr>
+      <w:rPr>
+        <w:rFonts w:ascii="Wingdings" w:hAnsi="Wingdings" w:hint="default"/>
+      </w:rPr>
+    </w:lvl>
+    <w:lvl w:ilvl="6" w:tplc="04070001" w:tentative="1">
+      <w:start w:val="1"/>
+      <w:numFmt w:val="bullet"/>
+      <w:lvlText w:val=""/>
+      <w:lvlJc w:val="left"/>
+      <w:pPr>
+        <w:ind w:left="7920" w:hanging="360"/>
+      </w:pPr>
+      <w:rPr>
+        <w:rFonts w:ascii="Symbol" w:hAnsi="Symbol" w:hint="default"/>
+      </w:rPr>
+    </w:lvl>
+    <w:lvl w:ilvl="7" w:tplc="04070003" w:tentative="1">
+      <w:start w:val="1"/>
+      <w:numFmt w:val="bullet"/>
+      <w:lvlText w:val="o"/>
+      <w:lvlJc w:val="left"/>
+      <w:pPr>
+        <w:ind w:left="8640" w:hanging="360"/>
+      </w:pPr>
+      <w:rPr>
+        <w:rFonts w:ascii="Courier New" w:hAnsi="Courier New" w:cs="Courier New" w:hint="default"/>
+      </w:rPr>
+    </w:lvl>
+    <w:lvl w:ilvl="8" w:tplc="04070005" w:tentative="1">
+      <w:start w:val="1"/>
+      <w:numFmt w:val="bullet"/>
+      <w:lvlText w:val=""/>
+      <w:lvlJc w:val="left"/>
+      <w:pPr>
+        <w:ind w:left="9360" w:hanging="360"/>
+      </w:pPr>
+      <w:rPr>
+        <w:rFonts w:ascii="Wingdings" w:hAnsi="Wingdings" w:hint="default"/>
+      </w:rPr>
+    </w:lvl>
+  </w:abstractNum>
+  <w:abstractNum w:abstractNumId="13" w15:restartNumberingAfterBreak="0">
     <w:nsid w:val="759E728B"/>
     <w:multiLevelType w:val="hybridMultilevel"/>
     <w:tmpl w:val="049072EA"/>
@@ -2474,7 +5407,7 @@
       </w:rPr>
     </w:lvl>
   </w:abstractNum>
-  <w:abstractNum w:abstractNumId="8" w15:restartNumberingAfterBreak="0">
+  <w:abstractNum w:abstractNumId="14" w15:restartNumberingAfterBreak="0">
     <w:nsid w:val="7BF82E92"/>
     <w:multiLevelType w:val="hybridMultilevel"/>
     <w:tmpl w:val="BE8A6FF6"/>
@@ -2588,31 +5521,49 @@
     </w:lvl>
   </w:abstractNum>
   <w:num w:numId="1" w16cid:durableId="398597777">
-    <w:abstractNumId w:val="5"/>
+    <w:abstractNumId w:val="10"/>
   </w:num>
   <w:num w:numId="2" w16cid:durableId="2018775612">
-    <w:abstractNumId w:val="2"/>
+    <w:abstractNumId w:val="4"/>
   </w:num>
   <w:num w:numId="3" w16cid:durableId="1074935120">
-    <w:abstractNumId w:val="8"/>
+    <w:abstractNumId w:val="14"/>
   </w:num>
   <w:num w:numId="4" w16cid:durableId="29764599">
-    <w:abstractNumId w:val="4"/>
+    <w:abstractNumId w:val="7"/>
   </w:num>
   <w:num w:numId="5" w16cid:durableId="1382286378">
     <w:abstractNumId w:val="0"/>
   </w:num>
   <w:num w:numId="6" w16cid:durableId="81149386">
+    <w:abstractNumId w:val="3"/>
+  </w:num>
+  <w:num w:numId="7" w16cid:durableId="225185064">
+    <w:abstractNumId w:val="13"/>
+  </w:num>
+  <w:num w:numId="8" w16cid:durableId="1662349140">
+    <w:abstractNumId w:val="6"/>
+  </w:num>
+  <w:num w:numId="9" w16cid:durableId="43600969">
+    <w:abstractNumId w:val="11"/>
+  </w:num>
+  <w:num w:numId="10" w16cid:durableId="1140224382">
+    <w:abstractNumId w:val="5"/>
+  </w:num>
+  <w:num w:numId="11" w16cid:durableId="858397848">
     <w:abstractNumId w:val="1"/>
   </w:num>
-  <w:num w:numId="7" w16cid:durableId="225185064">
-    <w:abstractNumId w:val="7"/>
+  <w:num w:numId="12" w16cid:durableId="1116752956">
+    <w:abstractNumId w:val="12"/>
   </w:num>
-  <w:num w:numId="8" w16cid:durableId="1662349140">
-    <w:abstractNumId w:val="3"/>
+  <w:num w:numId="13" w16cid:durableId="885994703">
+    <w:abstractNumId w:val="2"/>
   </w:num>
-  <w:num w:numId="9" w16cid:durableId="43600969">
-    <w:abstractNumId w:val="6"/>
+  <w:num w:numId="14" w16cid:durableId="130639136">
+    <w:abstractNumId w:val="9"/>
+  </w:num>
+  <w:num w:numId="15" w16cid:durableId="1544751820">
+    <w:abstractNumId w:val="8"/>
   </w:num>
 </w:numbering>
 </file>
@@ -3017,6 +5968,7 @@
   <w:style w:type="paragraph" w:default="1" w:styleId="Standard">
     <w:name w:val="Normal"/>
     <w:qFormat/>
+    <w:rsid w:val="002409AC"/>
   </w:style>
   <w:style w:type="paragraph" w:styleId="berschrift1">
     <w:name w:val="heading 1"/>
@@ -3044,7 +5996,6 @@
     <w:next w:val="Standard"/>
     <w:link w:val="berschrift2Zchn"/>
     <w:uiPriority w:val="9"/>
-    <w:semiHidden/>
     <w:unhideWhenUsed/>
     <w:rsid w:val="00937134"/>
     <w:pPr>
@@ -3218,6 +6169,7 @@
   <w:style w:type="character" w:default="1" w:styleId="Absatz-Standardschriftart">
     <w:name w:val="Default Paragraph Font"/>
     <w:uiPriority w:val="1"/>
+    <w:semiHidden/>
     <w:unhideWhenUsed/>
   </w:style>
   <w:style w:type="table" w:default="1" w:styleId="NormaleTabelle">
@@ -3259,7 +6211,6 @@
     <w:basedOn w:val="Absatz-Standardschriftart"/>
     <w:link w:val="berschrift2"/>
     <w:uiPriority w:val="9"/>
-    <w:semiHidden/>
     <w:rsid w:val="00937134"/>
     <w:rPr>
       <w:rFonts w:asciiTheme="majorHAnsi" w:eastAsiaTheme="majorEastAsia" w:hAnsiTheme="majorHAnsi" w:cstheme="majorBidi"/>
@@ -3555,21 +6506,21 @@
     <w:basedOn w:val="berschrift1"/>
     <w:link w:val="berschriftZchn"/>
     <w:qFormat/>
-    <w:rsid w:val="00937134"/>
+    <w:rsid w:val="002409AC"/>
     <w:rPr>
       <w:rFonts w:ascii="Arial" w:hAnsi="Arial"/>
       <w:color w:val="auto"/>
-      <w:sz w:val="36"/>
+      <w:sz w:val="44"/>
     </w:rPr>
   </w:style>
   <w:style w:type="character" w:customStyle="1" w:styleId="berschriftZchn">
     <w:name w:val="Überschrift Zchn"/>
     <w:basedOn w:val="Absatz-Standardschriftart"/>
     <w:link w:val="berschrift"/>
-    <w:rsid w:val="00937134"/>
+    <w:rsid w:val="002409AC"/>
     <w:rPr>
       <w:rFonts w:ascii="Arial" w:eastAsiaTheme="majorEastAsia" w:hAnsi="Arial" w:cstheme="majorBidi"/>
-      <w:sz w:val="36"/>
+      <w:sz w:val="44"/>
       <w:szCs w:val="40"/>
     </w:rPr>
   </w:style>
@@ -3598,12 +6549,17 @@
   </w:style>
   <w:style w:type="paragraph" w:customStyle="1" w:styleId="berschrift10">
     <w:name w:val="Überschrift1"/>
-    <w:basedOn w:val="berschrift"/>
+    <w:basedOn w:val="berschrift1"/>
     <w:next w:val="berschrift1"/>
     <w:link w:val="berschrift1Zchn0"/>
     <w:qFormat/>
-    <w:rsid w:val="00937134"/>
+    <w:rsid w:val="002409AC"/>
+    <w:pPr>
+      <w:outlineLvl w:val="1"/>
+    </w:pPr>
     <w:rPr>
+      <w:rFonts w:ascii="Arial" w:hAnsi="Arial"/>
+      <w:color w:val="auto"/>
       <w:sz w:val="28"/>
     </w:rPr>
   </w:style>
@@ -3611,7 +6567,7 @@
     <w:name w:val="Überschrift1 Zchn"/>
     <w:basedOn w:val="berschriftZchn"/>
     <w:link w:val="berschrift10"/>
-    <w:rsid w:val="00937134"/>
+    <w:rsid w:val="002409AC"/>
     <w:rPr>
       <w:rFonts w:ascii="Arial" w:eastAsiaTheme="majorEastAsia" w:hAnsi="Arial" w:cstheme="majorBidi"/>
       <w:sz w:val="28"/>
@@ -3626,6 +6582,146 @@
     <w:pPr>
       <w:spacing w:after="0" w:line="240" w:lineRule="auto"/>
     </w:pPr>
+  </w:style>
+  <w:style w:type="paragraph" w:styleId="Verzeichnis2">
+    <w:name w:val="toc 2"/>
+    <w:basedOn w:val="Standard"/>
+    <w:next w:val="Standard"/>
+    <w:autoRedefine/>
+    <w:uiPriority w:val="39"/>
+    <w:unhideWhenUsed/>
+    <w:rsid w:val="002409AC"/>
+    <w:pPr>
+      <w:spacing w:after="100"/>
+      <w:ind w:left="240"/>
+    </w:pPr>
+  </w:style>
+  <w:style w:type="paragraph" w:styleId="Verzeichnis3">
+    <w:name w:val="toc 3"/>
+    <w:basedOn w:val="Standard"/>
+    <w:next w:val="Standard"/>
+    <w:autoRedefine/>
+    <w:uiPriority w:val="39"/>
+    <w:unhideWhenUsed/>
+    <w:rsid w:val="002409AC"/>
+    <w:pPr>
+      <w:spacing w:after="100" w:line="259" w:lineRule="auto"/>
+      <w:ind w:left="440"/>
+    </w:pPr>
+    <w:rPr>
+      <w:rFonts w:eastAsiaTheme="minorEastAsia" w:cs="Times New Roman"/>
+      <w:kern w:val="0"/>
+      <w:sz w:val="22"/>
+      <w:szCs w:val="22"/>
+      <w:lang w:eastAsia="de-DE"/>
+      <w14:ligatures w14:val="none"/>
+    </w:rPr>
+  </w:style>
+  <w:style w:type="paragraph" w:styleId="Verzeichnis9">
+    <w:name w:val="toc 9"/>
+    <w:basedOn w:val="Standard"/>
+    <w:next w:val="Standard"/>
+    <w:autoRedefine/>
+    <w:uiPriority w:val="39"/>
+    <w:semiHidden/>
+    <w:unhideWhenUsed/>
+    <w:rsid w:val="002409AC"/>
+    <w:pPr>
+      <w:spacing w:after="100"/>
+      <w:ind w:left="1920"/>
+    </w:pPr>
+  </w:style>
+  <w:style w:type="character" w:styleId="NichtaufgelsteErwhnung">
+    <w:name w:val="Unresolved Mention"/>
+    <w:basedOn w:val="Absatz-Standardschriftart"/>
+    <w:uiPriority w:val="99"/>
+    <w:semiHidden/>
+    <w:unhideWhenUsed/>
+    <w:rsid w:val="005378A1"/>
+    <w:rPr>
+      <w:color w:val="605E5C"/>
+      <w:shd w:val="clear" w:color="auto" w:fill="E1DFDD"/>
+    </w:rPr>
+  </w:style>
+  <w:style w:type="paragraph" w:customStyle="1" w:styleId="berschrift20">
+    <w:name w:val="Überschrift2"/>
+    <w:basedOn w:val="berschrift2"/>
+    <w:link w:val="berschrift2Zchn0"/>
+    <w:qFormat/>
+    <w:rsid w:val="005425DA"/>
+    <w:rPr>
+      <w:rFonts w:ascii="Arial" w:hAnsi="Arial"/>
+      <w:color w:val="auto"/>
+      <w:sz w:val="26"/>
+    </w:rPr>
+  </w:style>
+  <w:style w:type="character" w:customStyle="1" w:styleId="berschrift2Zchn0">
+    <w:name w:val="Überschrift2 Zchn"/>
+    <w:basedOn w:val="berschrift2Zchn"/>
+    <w:link w:val="berschrift20"/>
+    <w:rsid w:val="005425DA"/>
+    <w:rPr>
+      <w:rFonts w:ascii="Arial" w:eastAsiaTheme="majorEastAsia" w:hAnsi="Arial" w:cstheme="majorBidi"/>
+      <w:color w:val="0F4761" w:themeColor="accent1" w:themeShade="BF"/>
+      <w:sz w:val="26"/>
+      <w:szCs w:val="32"/>
+    </w:rPr>
+  </w:style>
+  <w:style w:type="character" w:styleId="BesuchterLink">
+    <w:name w:val="FollowedHyperlink"/>
+    <w:basedOn w:val="Absatz-Standardschriftart"/>
+    <w:uiPriority w:val="99"/>
+    <w:semiHidden/>
+    <w:unhideWhenUsed/>
+    <w:rsid w:val="00210142"/>
+    <w:rPr>
+      <w:color w:val="96607D" w:themeColor="followedHyperlink"/>
+      <w:u w:val="single"/>
+    </w:rPr>
+  </w:style>
+  <w:style w:type="paragraph" w:styleId="Kopfzeile">
+    <w:name w:val="header"/>
+    <w:basedOn w:val="Standard"/>
+    <w:link w:val="KopfzeileZchn"/>
+    <w:uiPriority w:val="99"/>
+    <w:unhideWhenUsed/>
+    <w:rsid w:val="00B55102"/>
+    <w:pPr>
+      <w:tabs>
+        <w:tab w:val="center" w:pos="4536"/>
+        <w:tab w:val="right" w:pos="9072"/>
+      </w:tabs>
+      <w:spacing w:after="0" w:line="240" w:lineRule="auto"/>
+    </w:pPr>
+  </w:style>
+  <w:style w:type="character" w:customStyle="1" w:styleId="KopfzeileZchn">
+    <w:name w:val="Kopfzeile Zchn"/>
+    <w:basedOn w:val="Absatz-Standardschriftart"/>
+    <w:link w:val="Kopfzeile"/>
+    <w:uiPriority w:val="99"/>
+    <w:rsid w:val="00B55102"/>
+  </w:style>
+  <w:style w:type="paragraph" w:styleId="Fuzeile">
+    <w:name w:val="footer"/>
+    <w:basedOn w:val="Standard"/>
+    <w:link w:val="FuzeileZchn"/>
+    <w:uiPriority w:val="99"/>
+    <w:unhideWhenUsed/>
+    <w:rsid w:val="00B55102"/>
+    <w:pPr>
+      <w:tabs>
+        <w:tab w:val="center" w:pos="4536"/>
+        <w:tab w:val="right" w:pos="9072"/>
+      </w:tabs>
+      <w:spacing w:after="0" w:line="240" w:lineRule="auto"/>
+    </w:pPr>
+  </w:style>
+  <w:style w:type="character" w:customStyle="1" w:styleId="FuzeileZchn">
+    <w:name w:val="Fußzeile Zchn"/>
+    <w:basedOn w:val="Absatz-Standardschriftart"/>
+    <w:link w:val="Fuzeile"/>
+    <w:uiPriority w:val="99"/>
+    <w:rsid w:val="00B55102"/>
   </w:style>
 </w:styles>
 </file>

</xml_diff>